<commit_message>
Improved result handling accuracy + filters
</commit_message>
<xml_diff>
--- a/Docs/Project Proposal 2.docx
+++ b/Docs/Project Proposal 2.docx
@@ -1117,8 +1117,9 @@
                 <w:rFonts w:eastAsia="Arial" w:cs="Arial"/>
                 <w:sz w:val="21"/>
                 <w:szCs w:val="21"/>
-                <w:lang w:val="en-GB" w:eastAsia="en-US" w:bidi="ar-SA"/>
+                <w:lang w:val="en"/>
               </w:rPr>
+              <w:t xml:space="preserve">Parses, trains, take in threshhold and makes and model</w:t>
             </w:r>
             <w:r>
               <w:rPr>
@@ -1165,8 +1166,9 @@
                 <w:rFonts w:eastAsia="Arial" w:cs="Arial"/>
                 <w:sz w:val="21"/>
                 <w:szCs w:val="21"/>
-                <w:lang w:val="en-GB" w:eastAsia="en-US" w:bidi="ar-SA"/>
+                <w:lang w:val="en"/>
               </w:rPr>
+              <w:t xml:space="preserve">As expected</w:t>
             </w:r>
             <w:r>
               <w:rPr>
@@ -1208,18 +1210,10 @@
             </w:pPr>
             <w:r>
               <w:rPr>
-                <w:rFonts w:eastAsia="Arial" w:cs="Arial"/>
                 <w:color w:val="00b050"/>
-                <w:sz w:val="21"/>
-                <w:szCs w:val="21"/>
-                <w:lang w:val="en-US" w:eastAsia="en-US" w:bidi="en-US"/>
+                <w:lang w:val="en"/>
               </w:rPr>
-            </w:r>
-            <w:r>
-              <w:rPr>
-                <w:color w:val="00b050"/>
-                <w:lang w:val="en-US" w:bidi="en-US"/>
-              </w:rPr>
+              <w:t xml:space="preserve">Y</w:t>
             </w:r>
             <w:r>
               <w:rPr>
@@ -1896,8 +1890,9 @@
                 <w:rFonts w:eastAsia="Arial" w:cs="Arial"/>
                 <w:sz w:val="21"/>
                 <w:szCs w:val="21"/>
-                <w:lang w:val="en-GB" w:eastAsia="en-US" w:bidi="ar-SA"/>
+                <w:lang w:val="en"/>
               </w:rPr>
+              <w:t xml:space="preserve">As expected </w:t>
             </w:r>
             <w:r>
               <w:rPr>
@@ -1934,30 +1929,25 @@
               <w:jc w:val="left"/>
               <w:rPr>
                 <w:rFonts w:ascii="Aptos" w:hAnsi="Aptos" w:eastAsia="Arial" w:cs="Arial"/>
+                <w:color w:val="4ea72e" w:themeColor="accent6"/>
                 <w:sz w:val="21"/>
                 <w:szCs w:val="21"/>
-                <w:lang w:val="en-GB" w:eastAsia="en-US" w:bidi="ar-SA"/>
               </w:rPr>
             </w:pPr>
             <w:r>
               <w:rPr>
-                <w:rFonts w:eastAsia="Arial" w:cs="Arial"/>
+                <w:rFonts w:ascii="Aptos" w:hAnsi="Aptos" w:eastAsia="Arial" w:cs="Arial"/>
+                <w:color w:val="4ea72e" w:themeColor="accent6"/>
                 <w:sz w:val="21"/>
                 <w:szCs w:val="21"/>
-                <w:lang w:val="en-GB" w:eastAsia="en-US" w:bidi="ar-SA"/>
+                <w:lang w:val="en"/>
               </w:rPr>
+              <w:t xml:space="preserve">Y</w:t>
             </w:r>
             <w:r>
               <w:rPr>
                 <w:rFonts w:ascii="Aptos" w:hAnsi="Aptos" w:eastAsia="Arial" w:cs="Arial"/>
-                <w:sz w:val="21"/>
-                <w:szCs w:val="21"/>
-                <w:lang w:val="en-GB" w:eastAsia="en-US" w:bidi="ar-SA"/>
-              </w:rPr>
-            </w:r>
-            <w:r>
-              <w:rPr>
-                <w:rFonts w:ascii="Aptos" w:hAnsi="Aptos" w:eastAsia="Arial" w:cs="Arial"/>
+                <w:color w:val="4ea72e" w:themeColor="accent6"/>
                 <w:sz w:val="21"/>
                 <w:szCs w:val="21"/>
                 <w:lang w:val="en-GB" w:eastAsia="en-US" w:bidi="ar-SA"/>
@@ -6547,17 +6537,201 @@
     </w:p>
     <w:p>
       <w:pPr>
-        <w:pStyle w:val="893"/>
-        <w:widowControl w:val="true"/>
+        <w:pStyle w:val="894"/>
         <w:pBdr/>
         <w:bidi w:val="false"/>
-        <w:spacing w:after="160" w:afterAutospacing="0" w:before="0" w:beforeAutospacing="0" w:line="300" w:lineRule="auto"/>
-        <w:ind/>
-        <w:jc w:val="left"/>
+        <w:spacing/>
+        <w:ind/>
         <w:rPr/>
       </w:pPr>
+      <w:r>
+        <w:rPr>
+          <w:lang w:val="en"/>
+        </w:rPr>
+        <w:t xml:space="preserve">User Feedback</w:t>
+      </w:r>
       <w:r/>
+    </w:p>
+    <w:p>
+      <w:pPr>
+        <w:pStyle w:val="955"/>
+        <w:numPr>
+          <w:ilvl w:val="0"/>
+          <w:numId w:val="3"/>
+        </w:numPr>
+        <w:pBdr/>
+        <w:bidi w:val="false"/>
+        <w:spacing/>
+        <w:ind/>
+        <w:rPr/>
+      </w:pPr>
+      <w:r>
+        <w:rPr>
+          <w:lang w:val="en"/>
+        </w:rPr>
+        <w:t xml:space="preserve">Keep two side by side graphs but map acceleration through something like a colour gradient on the mouse position graph</w:t>
+      </w:r>
       <w:r/>
+    </w:p>
+    <w:p>
+      <w:pPr>
+        <w:pStyle w:val="955"/>
+        <w:numPr>
+          <w:ilvl w:val="0"/>
+          <w:numId w:val="3"/>
+        </w:numPr>
+        <w:pBdr/>
+        <w:bidi w:val="false"/>
+        <w:spacing/>
+        <w:ind/>
+        <w:rPr/>
+      </w:pPr>
+      <w:r>
+        <w:rPr>
+          <w:highlight w:val="none"/>
+          <w:lang w:val="en"/>
+        </w:rPr>
+        <w:t xml:space="preserve">Scoreboard bug when loading new demo with existing </w:t>
+      </w:r>
+      <w:r/>
+    </w:p>
+    <w:p>
+      <w:pPr>
+        <w:pStyle w:val="955"/>
+        <w:numPr>
+          <w:ilvl w:val="0"/>
+          <w:numId w:val="3"/>
+        </w:numPr>
+        <w:pBdr/>
+        <w:bidi w:val="false"/>
+        <w:spacing/>
+        <w:ind/>
+        <w:rPr/>
+      </w:pPr>
+      <w:r>
+        <w:rPr>
+          <w:highlight w:val="none"/>
+          <w:lang w:val="en"/>
+        </w:rPr>
+        <w:t xml:space="preserve">Change colour of slide borders to make more visable </w:t>
+      </w:r>
+      <w:r>
+        <w:rPr>
+          <w:highlight w:val="none"/>
+          <w:lang w:val="en"/>
+        </w:rPr>
+      </w:r>
+      <w:r/>
+    </w:p>
+    <w:p>
+      <w:pPr>
+        <w:pStyle w:val="955"/>
+        <w:numPr>
+          <w:ilvl w:val="0"/>
+          <w:numId w:val="3"/>
+        </w:numPr>
+        <w:pBdr/>
+        <w:bidi w:val="false"/>
+        <w:spacing/>
+        <w:ind/>
+        <w:rPr/>
+      </w:pPr>
+      <w:r>
+        <w:rPr>
+          <w:highlight w:val="none"/>
+          <w:lang w:val="en"/>
+        </w:rPr>
+        <w:t xml:space="preserve">Filter for name and weapons</w:t>
+      </w:r>
+      <w:r>
+        <w:rPr>
+          <w:highlight w:val="none"/>
+          <w:lang w:val="en"/>
+        </w:rPr>
+      </w:r>
+      <w:r/>
+    </w:p>
+    <w:p>
+      <w:pPr>
+        <w:pStyle w:val="955"/>
+        <w:numPr>
+          <w:ilvl w:val="0"/>
+          <w:numId w:val="3"/>
+        </w:numPr>
+        <w:pBdr/>
+        <w:bidi w:val="false"/>
+        <w:spacing/>
+        <w:ind/>
+        <w:rPr/>
+      </w:pPr>
+      <w:r>
+        <w:rPr>
+          <w:highlight w:val="none"/>
+          <w:lang w:val="en"/>
+        </w:rPr>
+        <w:t xml:space="preserve">Like Racetrack telemtry </w:t>
+      </w:r>
+      <w:r/>
+    </w:p>
+    <w:p>
+      <w:pPr>
+        <w:pStyle w:val="955"/>
+        <w:numPr>
+          <w:ilvl w:val="0"/>
+          <w:numId w:val="3"/>
+        </w:numPr>
+        <w:pBdr/>
+        <w:bidi w:val="false"/>
+        <w:spacing/>
+        <w:ind/>
+        <w:rPr/>
+      </w:pPr>
+      <w:r>
+        <w:rPr>
+          <w:highlight w:val="none"/>
+          <w:lang w:val="en"/>
+        </w:rPr>
+        <w:t xml:space="preserve">SSG overreports cheating likely due to use bias of cheaters</w:t>
+      </w:r>
+      <w:r>
+        <w:rPr>
+          <w:highlight w:val="none"/>
+          <w:lang w:val="en"/>
+        </w:rPr>
+      </w:r>
+      <w:r/>
+    </w:p>
+    <w:p>
+      <w:pPr>
+        <w:pStyle w:val="955"/>
+        <w:numPr>
+          <w:ilvl w:val="0"/>
+          <w:numId w:val="3"/>
+        </w:numPr>
+        <w:pBdr/>
+        <w:bidi w:val="false"/>
+        <w:spacing/>
+        <w:ind/>
+        <w:rPr/>
+      </w:pPr>
+      <w:r>
+        <w:rPr>
+          <w:highlight w:val="none"/>
+          <w:lang w:val="en"/>
+        </w:rPr>
+      </w:r>
+      <w:r>
+        <w:rPr>
+          <w:highlight w:val="none"/>
+          <w:lang w:val="en"/>
+        </w:rPr>
+      </w:r>
+      <w:r>
+        <w:rPr>
+          <w:highlight w:val="none"/>
+          <w:lang w:val="en"/>
+        </w:rPr>
+      </w:r>
     </w:p>
     <w:sectPr>
       <w:headerReference w:type="default" r:id="rId9"/>
@@ -7405,11 +7579,161 @@
       <w:suff w:val="nothing"/>
     </w:lvl>
   </w:abstractNum>
+  <w:abstractNum w:abstractNumId="2">
+    <w:nsid w:val="2C64C060"/>
+    <w:lvl w:ilvl="0">
+      <w:isLgl w:val="false"/>
+      <w:lvlJc w:val="left"/>
+      <w:lvlText w:val="·"/>
+      <w:numFmt w:val="bullet"/>
+      <w:pPr>
+        <w:pBdr/>
+        <w:spacing/>
+        <w:ind w:hanging="360" w:left="709"/>
+      </w:pPr>
+      <w:rPr>
+        <w:rFonts w:hint="default" w:ascii="Symbol" w:hAnsi="Symbol" w:eastAsia="Symbol" w:cs="Symbol"/>
+      </w:rPr>
+      <w:start w:val="1"/>
+      <w:suff w:val="tab"/>
+    </w:lvl>
+    <w:lvl w:ilvl="1">
+      <w:isLgl w:val="false"/>
+      <w:lvlJc w:val="left"/>
+      <w:lvlText w:val="o"/>
+      <w:numFmt w:val="bullet"/>
+      <w:pPr>
+        <w:pBdr/>
+        <w:spacing/>
+        <w:ind w:hanging="360" w:left="1429"/>
+      </w:pPr>
+      <w:rPr>
+        <w:rFonts w:hint="default" w:ascii="Courier New" w:hAnsi="Courier New" w:eastAsia="Courier New" w:cs="Courier New"/>
+      </w:rPr>
+      <w:start w:val="1"/>
+      <w:suff w:val="tab"/>
+    </w:lvl>
+    <w:lvl w:ilvl="2">
+      <w:isLgl w:val="false"/>
+      <w:lvlJc w:val="left"/>
+      <w:lvlText w:val="§"/>
+      <w:numFmt w:val="bullet"/>
+      <w:pPr>
+        <w:pBdr/>
+        <w:spacing/>
+        <w:ind w:hanging="360" w:left="2149"/>
+      </w:pPr>
+      <w:rPr>
+        <w:rFonts w:hint="default" w:ascii="Wingdings" w:hAnsi="Wingdings" w:eastAsia="Wingdings" w:cs="Wingdings"/>
+      </w:rPr>
+      <w:start w:val="1"/>
+      <w:suff w:val="tab"/>
+    </w:lvl>
+    <w:lvl w:ilvl="3">
+      <w:isLgl w:val="false"/>
+      <w:lvlJc w:val="left"/>
+      <w:lvlText w:val="·"/>
+      <w:numFmt w:val="bullet"/>
+      <w:pPr>
+        <w:pBdr/>
+        <w:spacing/>
+        <w:ind w:hanging="360" w:left="2869"/>
+      </w:pPr>
+      <w:rPr>
+        <w:rFonts w:hint="default" w:ascii="Symbol" w:hAnsi="Symbol" w:eastAsia="Symbol" w:cs="Symbol"/>
+      </w:rPr>
+      <w:start w:val="1"/>
+      <w:suff w:val="tab"/>
+    </w:lvl>
+    <w:lvl w:ilvl="4">
+      <w:isLgl w:val="false"/>
+      <w:lvlJc w:val="left"/>
+      <w:lvlText w:val="o"/>
+      <w:numFmt w:val="bullet"/>
+      <w:pPr>
+        <w:pBdr/>
+        <w:spacing/>
+        <w:ind w:hanging="360" w:left="3589"/>
+      </w:pPr>
+      <w:rPr>
+        <w:rFonts w:hint="default" w:ascii="Courier New" w:hAnsi="Courier New" w:eastAsia="Courier New" w:cs="Courier New"/>
+      </w:rPr>
+      <w:start w:val="1"/>
+      <w:suff w:val="tab"/>
+    </w:lvl>
+    <w:lvl w:ilvl="5">
+      <w:isLgl w:val="false"/>
+      <w:lvlJc w:val="left"/>
+      <w:lvlText w:val="§"/>
+      <w:numFmt w:val="bullet"/>
+      <w:pPr>
+        <w:pBdr/>
+        <w:spacing/>
+        <w:ind w:hanging="360" w:left="4309"/>
+      </w:pPr>
+      <w:rPr>
+        <w:rFonts w:hint="default" w:ascii="Wingdings" w:hAnsi="Wingdings" w:eastAsia="Wingdings" w:cs="Wingdings"/>
+      </w:rPr>
+      <w:start w:val="1"/>
+      <w:suff w:val="tab"/>
+    </w:lvl>
+    <w:lvl w:ilvl="6">
+      <w:isLgl w:val="false"/>
+      <w:lvlJc w:val="left"/>
+      <w:lvlText w:val="·"/>
+      <w:numFmt w:val="bullet"/>
+      <w:pPr>
+        <w:pBdr/>
+        <w:spacing/>
+        <w:ind w:hanging="360" w:left="5029"/>
+      </w:pPr>
+      <w:rPr>
+        <w:rFonts w:hint="default" w:ascii="Symbol" w:hAnsi="Symbol" w:eastAsia="Symbol" w:cs="Symbol"/>
+      </w:rPr>
+      <w:start w:val="1"/>
+      <w:suff w:val="tab"/>
+    </w:lvl>
+    <w:lvl w:ilvl="7">
+      <w:isLgl w:val="false"/>
+      <w:lvlJc w:val="left"/>
+      <w:lvlText w:val="o"/>
+      <w:numFmt w:val="bullet"/>
+      <w:pPr>
+        <w:pBdr/>
+        <w:spacing/>
+        <w:ind w:hanging="360" w:left="5749"/>
+      </w:pPr>
+      <w:rPr>
+        <w:rFonts w:hint="default" w:ascii="Courier New" w:hAnsi="Courier New" w:eastAsia="Courier New" w:cs="Courier New"/>
+      </w:rPr>
+      <w:start w:val="1"/>
+      <w:suff w:val="tab"/>
+    </w:lvl>
+    <w:lvl w:ilvl="8">
+      <w:isLgl w:val="false"/>
+      <w:lvlJc w:val="left"/>
+      <w:lvlText w:val="§"/>
+      <w:numFmt w:val="bullet"/>
+      <w:pPr>
+        <w:pBdr/>
+        <w:spacing/>
+        <w:ind w:hanging="360" w:left="6469"/>
+      </w:pPr>
+      <w:rPr>
+        <w:rFonts w:hint="default" w:ascii="Wingdings" w:hAnsi="Wingdings" w:eastAsia="Wingdings" w:cs="Wingdings"/>
+      </w:rPr>
+      <w:start w:val="1"/>
+      <w:suff w:val="tab"/>
+    </w:lvl>
+  </w:abstractNum>
   <w:num w:numId="1">
     <w:abstractNumId w:val="0"/>
   </w:num>
   <w:num w:numId="2">
     <w:abstractNumId w:val="1"/>
+  </w:num>
+  <w:num w:numId="3">
+    <w:abstractNumId w:val="2"/>
   </w:num>
 </w:numbering>
 </file>

</xml_diff>

<commit_message>
Env Integration for config
Add env file and example file additionally to a program for refinement and ingestion of these files
</commit_message>
<xml_diff>
--- a/Docs/Project Proposal 2.docx
+++ b/Docs/Project Proposal 2.docx
@@ -4,7 +4,7 @@
   <w:body>
     <w:p>
       <w:pPr>
-        <w:pStyle w:val="952"/>
+        <w:pStyle w:val="954"/>
         <w:pBdr/>
         <w:spacing/>
         <w:ind/>
@@ -51,7 +51,7 @@
     </w:p>
     <w:p>
       <w:pPr>
-        <w:pStyle w:val="894"/>
+        <w:pStyle w:val="896"/>
         <w:pBdr/>
         <w:spacing/>
         <w:ind/>
@@ -64,7 +64,7 @@
     </w:p>
     <w:p>
       <w:pPr>
-        <w:pStyle w:val="893"/>
+        <w:pStyle w:val="895"/>
         <w:pBdr/>
         <w:spacing/>
         <w:ind/>
@@ -89,7 +89,7 @@
     </w:p>
     <w:p>
       <w:pPr>
-        <w:pStyle w:val="894"/>
+        <w:pStyle w:val="896"/>
         <w:pBdr/>
         <w:spacing/>
         <w:ind/>
@@ -102,7 +102,7 @@
     </w:p>
     <w:p>
       <w:pPr>
-        <w:pStyle w:val="893"/>
+        <w:pStyle w:val="895"/>
         <w:pBdr/>
         <w:spacing/>
         <w:ind/>
@@ -129,7 +129,7 @@
       <w:hyperlink r:id="rId15" w:tooltip="https://expose.gg/" w:history="1">
         <w:r>
           <w:rPr>
-            <w:rStyle w:val="929"/>
+            <w:rStyle w:val="931"/>
           </w:rPr>
           <w:t xml:space="preserve">expose.gg</w:t>
         </w:r>
@@ -141,7 +141,7 @@
     </w:p>
     <w:p>
       <w:pPr>
-        <w:pStyle w:val="893"/>
+        <w:pStyle w:val="895"/>
         <w:pBdr/>
         <w:spacing/>
         <w:ind/>
@@ -152,7 +152,7 @@
     </w:p>
     <w:p>
       <w:pPr>
-        <w:pStyle w:val="894"/>
+        <w:pStyle w:val="896"/>
         <w:pBdr/>
         <w:spacing/>
         <w:ind/>
@@ -165,7 +165,7 @@
     </w:p>
     <w:p>
       <w:pPr>
-        <w:pStyle w:val="894"/>
+        <w:pStyle w:val="896"/>
         <w:pBdr/>
         <w:spacing/>
         <w:ind/>
@@ -178,7 +178,7 @@
     </w:p>
     <w:p>
       <w:pPr>
-        <w:pStyle w:val="893"/>
+        <w:pStyle w:val="895"/>
         <w:pBdr/>
         <w:spacing/>
         <w:ind/>
@@ -212,7 +212,7 @@
     </w:p>
     <w:p>
       <w:pPr>
-        <w:pStyle w:val="894"/>
+        <w:pStyle w:val="896"/>
         <w:pBdr/>
         <w:spacing/>
         <w:ind/>
@@ -225,7 +225,7 @@
     </w:p>
     <w:tbl>
       <w:tblPr>
-        <w:tblStyle w:val="1091"/>
+        <w:tblStyle w:val="1093"/>
         <w:tblInd w:w="0" w:type="dxa"/>
         <w:tblW w:w="9475" w:type="dxa"/>
         <w:tblCellMar>
@@ -259,7 +259,7 @@
           </w:tcPr>
           <w:p>
             <w:pPr>
-              <w:pStyle w:val="893"/>
+              <w:pStyle w:val="895"/>
               <w:widowControl w:val="true"/>
               <w:pBdr/>
               <w:spacing w:after="0" w:before="0" w:line="240" w:lineRule="auto"/>
@@ -294,7 +294,7 @@
           </w:p>
           <w:p>
             <w:pPr>
-              <w:pStyle w:val="893"/>
+              <w:pStyle w:val="895"/>
               <w:widowControl w:val="true"/>
               <w:pBdr/>
               <w:spacing w:after="0" w:before="0" w:line="240" w:lineRule="auto"/>
@@ -343,7 +343,7 @@
           </w:tcPr>
           <w:p>
             <w:pPr>
-              <w:pStyle w:val="893"/>
+              <w:pStyle w:val="895"/>
               <w:widowControl w:val="true"/>
               <w:pBdr/>
               <w:spacing w:after="0" w:before="0" w:line="240" w:lineRule="auto"/>
@@ -392,7 +392,7 @@
           </w:tcPr>
           <w:p>
             <w:pPr>
-              <w:pStyle w:val="893"/>
+              <w:pStyle w:val="895"/>
               <w:widowControl w:val="true"/>
               <w:pBdr/>
               <w:spacing w:after="0" w:before="0" w:line="240" w:lineRule="auto"/>
@@ -441,7 +441,7 @@
           </w:tcPr>
           <w:p>
             <w:pPr>
-              <w:pStyle w:val="893"/>
+              <w:pStyle w:val="895"/>
               <w:widowControl w:val="true"/>
               <w:pBdr/>
               <w:spacing w:after="0" w:before="0" w:line="240" w:lineRule="auto"/>
@@ -490,7 +490,7 @@
           </w:tcPr>
           <w:p>
             <w:pPr>
-              <w:pStyle w:val="893"/>
+              <w:pStyle w:val="895"/>
               <w:widowControl w:val="true"/>
               <w:pBdr/>
               <w:spacing w:after="0" w:before="0" w:line="240" w:lineRule="auto"/>
@@ -560,7 +560,7 @@
           </w:p>
           <w:p>
             <w:pPr>
-              <w:pStyle w:val="893"/>
+              <w:pStyle w:val="895"/>
               <w:widowControl w:val="true"/>
               <w:pBdr/>
               <w:spacing w:after="0" w:before="0" w:line="240" w:lineRule="auto"/>
@@ -599,7 +599,7 @@
           </w:tcPr>
           <w:p>
             <w:pPr>
-              <w:pStyle w:val="893"/>
+              <w:pStyle w:val="895"/>
               <w:widowControl w:val="true"/>
               <w:pBdr/>
               <w:spacing w:after="0" w:before="0" w:line="240" w:lineRule="auto"/>
@@ -644,7 +644,7 @@
           </w:tcPr>
           <w:p>
             <w:pPr>
-              <w:pStyle w:val="893"/>
+              <w:pStyle w:val="895"/>
               <w:widowControl w:val="true"/>
               <w:pBdr/>
               <w:spacing w:after="0" w:before="0" w:line="240" w:lineRule="auto"/>
@@ -679,7 +679,7 @@
           </w:p>
           <w:p>
             <w:pPr>
-              <w:pStyle w:val="893"/>
+              <w:pStyle w:val="895"/>
               <w:widowControl w:val="true"/>
               <w:pBdr/>
               <w:spacing w:after="0" w:before="0" w:line="240" w:lineRule="auto"/>
@@ -719,7 +719,7 @@
           </w:p>
           <w:p>
             <w:pPr>
-              <w:pStyle w:val="893"/>
+              <w:pStyle w:val="895"/>
               <w:widowControl w:val="true"/>
               <w:pBdr/>
               <w:spacing w:after="0" w:before="0" w:line="240" w:lineRule="auto"/>
@@ -768,7 +768,7 @@
           </w:tcPr>
           <w:p>
             <w:pPr>
-              <w:pStyle w:val="893"/>
+              <w:pStyle w:val="895"/>
               <w:widowControl w:val="true"/>
               <w:pBdr/>
               <w:spacing w:after="0" w:before="0" w:line="240" w:lineRule="auto"/>
@@ -817,7 +817,7 @@
           </w:tcPr>
           <w:p>
             <w:pPr>
-              <w:pStyle w:val="893"/>
+              <w:pStyle w:val="895"/>
               <w:widowControl w:val="true"/>
               <w:pBdr/>
               <w:spacing w:after="0" w:before="0" w:line="240" w:lineRule="auto"/>
@@ -866,7 +866,7 @@
           </w:tcPr>
           <w:p>
             <w:pPr>
-              <w:pStyle w:val="893"/>
+              <w:pStyle w:val="895"/>
               <w:widowControl w:val="true"/>
               <w:pBdr/>
               <w:spacing w:after="0" w:before="0" w:line="240" w:lineRule="auto"/>
@@ -915,7 +915,7 @@
           </w:tcPr>
           <w:p>
             <w:pPr>
-              <w:pStyle w:val="893"/>
+              <w:pStyle w:val="895"/>
               <w:widowControl w:val="true"/>
               <w:pBdr/>
               <w:spacing w:after="0" w:before="0" w:line="240" w:lineRule="auto"/>
@@ -965,7 +965,7 @@
           </w:tcPr>
           <w:p>
             <w:pPr>
-              <w:pStyle w:val="893"/>
+              <w:pStyle w:val="895"/>
               <w:widowControl w:val="true"/>
               <w:pBdr/>
               <w:spacing w:after="0" w:before="0" w:line="240" w:lineRule="auto"/>
@@ -1010,7 +1010,7 @@
           </w:tcPr>
           <w:p>
             <w:pPr>
-              <w:pStyle w:val="893"/>
+              <w:pStyle w:val="895"/>
               <w:widowControl w:val="true"/>
               <w:pBdr/>
               <w:spacing w:after="0" w:before="0" w:line="240" w:lineRule="auto"/>
@@ -1050,7 +1050,7 @@
           </w:tcPr>
           <w:p>
             <w:pPr>
-              <w:pStyle w:val="893"/>
+              <w:pStyle w:val="895"/>
               <w:widowControl w:val="true"/>
               <w:pBdr/>
               <w:spacing w:after="0" w:before="0" w:line="240" w:lineRule="auto"/>
@@ -1099,7 +1099,7 @@
           </w:tcPr>
           <w:p>
             <w:pPr>
-              <w:pStyle w:val="893"/>
+              <w:pStyle w:val="895"/>
               <w:widowControl w:val="true"/>
               <w:pBdr/>
               <w:spacing w:after="0" w:before="0" w:line="240" w:lineRule="auto"/>
@@ -1148,7 +1148,7 @@
           </w:tcPr>
           <w:p>
             <w:pPr>
-              <w:pStyle w:val="893"/>
+              <w:pStyle w:val="895"/>
               <w:widowControl w:val="true"/>
               <w:pBdr/>
               <w:spacing w:after="0" w:before="0" w:line="240" w:lineRule="auto"/>
@@ -1197,7 +1197,7 @@
           </w:tcPr>
           <w:p>
             <w:pPr>
-              <w:pStyle w:val="893"/>
+              <w:pStyle w:val="895"/>
               <w:widowControl w:val="true"/>
               <w:pBdr/>
               <w:spacing w:after="0" w:before="0" w:line="240" w:lineRule="auto"/>
@@ -1221,6 +1221,12 @@
                 <w:lang w:val="en-US" w:bidi="en-US"/>
               </w:rPr>
             </w:r>
+            <w:r>
+              <w:rPr>
+                <w:color w:val="00b050"/>
+                <w:lang w:val="en-US" w:bidi="en-US"/>
+              </w:rPr>
+            </w:r>
           </w:p>
         </w:tc>
         <w:tc>
@@ -1232,7 +1238,7 @@
           </w:tcPr>
           <w:p>
             <w:pPr>
-              <w:pStyle w:val="893"/>
+              <w:pStyle w:val="895"/>
               <w:widowControl w:val="true"/>
               <w:pBdr/>
               <w:spacing w:after="0" w:before="0" w:line="240" w:lineRule="auto"/>
@@ -1276,7 +1282,7 @@
           </w:tcPr>
           <w:p>
             <w:pPr>
-              <w:pStyle w:val="893"/>
+              <w:pStyle w:val="895"/>
               <w:widowControl w:val="true"/>
               <w:pBdr/>
               <w:spacing w:after="0" w:before="0" w:line="240" w:lineRule="auto"/>
@@ -1308,7 +1314,7 @@
           </w:p>
           <w:p>
             <w:pPr>
-              <w:pStyle w:val="893"/>
+              <w:pStyle w:val="895"/>
               <w:widowControl w:val="true"/>
               <w:pBdr/>
               <w:spacing w:after="0" w:before="0" w:line="240" w:lineRule="auto"/>
@@ -1348,7 +1354,7 @@
           </w:p>
           <w:p>
             <w:pPr>
-              <w:pStyle w:val="893"/>
+              <w:pStyle w:val="895"/>
               <w:widowControl w:val="true"/>
               <w:pBdr/>
               <w:spacing w:after="0" w:before="0" w:line="240" w:lineRule="auto"/>
@@ -1397,7 +1403,7 @@
           </w:tcPr>
           <w:p>
             <w:pPr>
-              <w:pStyle w:val="893"/>
+              <w:pStyle w:val="895"/>
               <w:widowControl w:val="true"/>
               <w:pBdr/>
               <w:spacing w:after="0" w:before="0" w:line="240" w:lineRule="auto"/>
@@ -1446,7 +1452,7 @@
           </w:tcPr>
           <w:p>
             <w:pPr>
-              <w:pStyle w:val="893"/>
+              <w:pStyle w:val="895"/>
               <w:widowControl w:val="true"/>
               <w:pBdr/>
               <w:spacing w:after="0" w:before="0" w:line="240" w:lineRule="auto"/>
@@ -1495,7 +1501,7 @@
           </w:tcPr>
           <w:p>
             <w:pPr>
-              <w:pStyle w:val="893"/>
+              <w:pStyle w:val="895"/>
               <w:widowControl w:val="true"/>
               <w:pBdr/>
               <w:spacing w:after="0" w:before="0" w:line="240" w:lineRule="auto"/>
@@ -1543,7 +1549,7 @@
           </w:tcPr>
           <w:p>
             <w:pPr>
-              <w:pStyle w:val="893"/>
+              <w:pStyle w:val="895"/>
               <w:widowControl w:val="true"/>
               <w:pBdr/>
               <w:spacing w:after="0" w:before="0" w:line="240" w:lineRule="auto"/>
@@ -1591,7 +1597,7 @@
           </w:tcPr>
           <w:p>
             <w:pPr>
-              <w:pStyle w:val="893"/>
+              <w:pStyle w:val="895"/>
               <w:widowControl w:val="true"/>
               <w:pBdr/>
               <w:spacing w:after="0" w:before="0" w:line="240" w:lineRule="auto"/>
@@ -1644,7 +1650,7 @@
           </w:tcPr>
           <w:p>
             <w:pPr>
-              <w:pStyle w:val="893"/>
+              <w:pStyle w:val="895"/>
               <w:widowControl w:val="true"/>
               <w:pBdr/>
               <w:spacing w:after="0" w:before="0" w:line="240" w:lineRule="auto"/>
@@ -1676,7 +1682,7 @@
           </w:p>
           <w:p>
             <w:pPr>
-              <w:pStyle w:val="893"/>
+              <w:pStyle w:val="895"/>
               <w:widowControl w:val="true"/>
               <w:pBdr/>
               <w:spacing w:after="0" w:before="0" w:line="240" w:lineRule="auto"/>
@@ -1716,7 +1722,7 @@
           </w:p>
           <w:p>
             <w:pPr>
-              <w:pStyle w:val="893"/>
+              <w:pStyle w:val="895"/>
               <w:widowControl w:val="true"/>
               <w:pBdr/>
               <w:spacing w:after="0" w:before="0" w:line="240" w:lineRule="auto"/>
@@ -1765,7 +1771,7 @@
           </w:tcPr>
           <w:p>
             <w:pPr>
-              <w:pStyle w:val="893"/>
+              <w:pStyle w:val="895"/>
               <w:widowControl w:val="true"/>
               <w:pBdr/>
               <w:spacing w:after="0" w:before="0" w:line="240" w:lineRule="auto"/>
@@ -1814,7 +1820,7 @@
           </w:tcPr>
           <w:p>
             <w:pPr>
-              <w:pStyle w:val="893"/>
+              <w:pStyle w:val="895"/>
               <w:widowControl w:val="true"/>
               <w:pBdr/>
               <w:spacing w:after="0" w:before="0" w:line="240" w:lineRule="auto"/>
@@ -1872,7 +1878,7 @@
           </w:tcPr>
           <w:p>
             <w:pPr>
-              <w:pStyle w:val="893"/>
+              <w:pStyle w:val="895"/>
               <w:widowControl w:val="true"/>
               <w:pBdr/>
               <w:spacing w:after="0" w:before="0" w:line="240" w:lineRule="auto"/>
@@ -1921,7 +1927,7 @@
           </w:tcPr>
           <w:p>
             <w:pPr>
-              <w:pStyle w:val="893"/>
+              <w:pStyle w:val="895"/>
               <w:widowControl w:val="true"/>
               <w:pBdr/>
               <w:spacing w:after="0" w:before="0" w:line="240" w:lineRule="auto"/>
@@ -1953,6 +1959,14 @@
                 <w:lang w:val="en-GB" w:eastAsia="en-US" w:bidi="ar-SA"/>
               </w:rPr>
             </w:r>
+            <w:r>
+              <w:rPr>
+                <w:rFonts w:ascii="Aptos" w:hAnsi="Aptos" w:eastAsia="Arial" w:cs="Arial"/>
+                <w:color w:val="4ea72e" w:themeColor="accent6"/>
+                <w:sz w:val="21"/>
+                <w:szCs w:val="21"/>
+              </w:rPr>
+            </w:r>
           </w:p>
         </w:tc>
         <w:tc>
@@ -1964,7 +1978,7 @@
           </w:tcPr>
           <w:p>
             <w:pPr>
-              <w:pStyle w:val="893"/>
+              <w:pStyle w:val="895"/>
               <w:widowControl w:val="true"/>
               <w:pBdr/>
               <w:spacing w:after="0" w:before="0" w:line="240" w:lineRule="auto"/>
@@ -2017,7 +2031,7 @@
           </w:tcPr>
           <w:p>
             <w:pPr>
-              <w:pStyle w:val="893"/>
+              <w:pStyle w:val="895"/>
               <w:widowControl w:val="true"/>
               <w:pBdr/>
               <w:spacing w:after="0" w:before="0" w:line="240" w:lineRule="auto"/>
@@ -2049,7 +2063,7 @@
           </w:p>
           <w:p>
             <w:pPr>
-              <w:pStyle w:val="893"/>
+              <w:pStyle w:val="895"/>
               <w:widowControl w:val="true"/>
               <w:pBdr/>
               <w:spacing w:after="0" w:before="0" w:line="240" w:lineRule="auto"/>
@@ -2089,7 +2103,7 @@
           </w:p>
           <w:p>
             <w:pPr>
-              <w:pStyle w:val="893"/>
+              <w:pStyle w:val="895"/>
               <w:widowControl w:val="true"/>
               <w:pBdr/>
               <w:spacing w:after="0" w:before="0" w:line="240" w:lineRule="auto"/>
@@ -2132,7 +2146,7 @@
           </w:tcPr>
           <w:p>
             <w:pPr>
-              <w:pStyle w:val="893"/>
+              <w:pStyle w:val="895"/>
               <w:widowControl w:val="true"/>
               <w:pBdr/>
               <w:spacing w:after="0" w:before="0" w:line="240" w:lineRule="auto"/>
@@ -2181,7 +2195,7 @@
           </w:tcPr>
           <w:p>
             <w:pPr>
-              <w:pStyle w:val="893"/>
+              <w:pStyle w:val="895"/>
               <w:widowControl w:val="true"/>
               <w:pBdr/>
               <w:spacing w:after="0" w:before="0" w:line="240" w:lineRule="auto"/>
@@ -2230,7 +2244,7 @@
           </w:tcPr>
           <w:p>
             <w:pPr>
-              <w:pStyle w:val="893"/>
+              <w:pStyle w:val="895"/>
               <w:widowControl w:val="true"/>
               <w:pBdr/>
               <w:spacing w:after="0" w:before="0" w:line="240" w:lineRule="auto"/>
@@ -2278,7 +2292,7 @@
           </w:tcPr>
           <w:p>
             <w:pPr>
-              <w:pStyle w:val="893"/>
+              <w:pStyle w:val="895"/>
               <w:widowControl w:val="true"/>
               <w:pBdr/>
               <w:spacing w:after="0" w:before="0" w:line="240" w:lineRule="auto"/>
@@ -2326,7 +2340,7 @@
           </w:tcPr>
           <w:p>
             <w:pPr>
-              <w:pStyle w:val="893"/>
+              <w:pStyle w:val="895"/>
               <w:widowControl w:val="true"/>
               <w:pBdr/>
               <w:spacing w:after="0" w:before="0" w:line="240" w:lineRule="auto"/>
@@ -2379,7 +2393,7 @@
           </w:tcPr>
           <w:p>
             <w:pPr>
-              <w:pStyle w:val="893"/>
+              <w:pStyle w:val="895"/>
               <w:widowControl w:val="true"/>
               <w:pBdr/>
               <w:spacing w:after="0" w:before="0" w:line="240" w:lineRule="auto"/>
@@ -2428,7 +2442,7 @@
           </w:tcPr>
           <w:p>
             <w:pPr>
-              <w:pStyle w:val="893"/>
+              <w:pStyle w:val="895"/>
               <w:widowControl w:val="true"/>
               <w:pBdr/>
               <w:spacing w:after="0" w:before="0" w:line="240" w:lineRule="auto"/>
@@ -2477,7 +2491,7 @@
           </w:tcPr>
           <w:p>
             <w:pPr>
-              <w:pStyle w:val="893"/>
+              <w:pStyle w:val="895"/>
               <w:widowControl w:val="true"/>
               <w:pBdr/>
               <w:spacing w:after="0" w:before="0" w:line="240" w:lineRule="auto"/>
@@ -2526,7 +2540,7 @@
           </w:tcPr>
           <w:p>
             <w:pPr>
-              <w:pStyle w:val="893"/>
+              <w:pStyle w:val="895"/>
               <w:widowControl w:val="true"/>
               <w:pBdr/>
               <w:spacing w:after="0" w:before="0" w:line="240" w:lineRule="auto"/>
@@ -2574,7 +2588,7 @@
           </w:tcPr>
           <w:p>
             <w:pPr>
-              <w:pStyle w:val="893"/>
+              <w:pStyle w:val="895"/>
               <w:widowControl w:val="true"/>
               <w:pBdr/>
               <w:spacing w:after="0" w:before="0" w:line="240" w:lineRule="auto"/>
@@ -2622,7 +2636,7 @@
           </w:tcPr>
           <w:p>
             <w:pPr>
-              <w:pStyle w:val="893"/>
+              <w:pStyle w:val="895"/>
               <w:widowControl w:val="true"/>
               <w:pBdr/>
               <w:spacing w:after="0" w:before="0" w:line="240" w:lineRule="auto"/>
@@ -2675,7 +2689,7 @@
           </w:tcPr>
           <w:p>
             <w:pPr>
-              <w:pStyle w:val="893"/>
+              <w:pStyle w:val="895"/>
               <w:widowControl w:val="true"/>
               <w:pBdr/>
               <w:spacing w:after="0" w:before="0" w:line="240" w:lineRule="auto"/>
@@ -2724,7 +2738,7 @@
           </w:tcPr>
           <w:p>
             <w:pPr>
-              <w:pStyle w:val="893"/>
+              <w:pStyle w:val="895"/>
               <w:widowControl w:val="true"/>
               <w:pBdr/>
               <w:spacing w:after="0" w:before="0" w:line="240" w:lineRule="auto"/>
@@ -2773,7 +2787,7 @@
           </w:tcPr>
           <w:p>
             <w:pPr>
-              <w:pStyle w:val="893"/>
+              <w:pStyle w:val="895"/>
               <w:widowControl w:val="true"/>
               <w:pBdr/>
               <w:spacing w:after="0" w:before="0" w:line="240" w:lineRule="auto"/>
@@ -2822,7 +2836,7 @@
           </w:tcPr>
           <w:p>
             <w:pPr>
-              <w:pStyle w:val="893"/>
+              <w:pStyle w:val="895"/>
               <w:widowControl w:val="true"/>
               <w:pBdr/>
               <w:spacing w:after="0" w:before="0" w:line="240" w:lineRule="auto"/>
@@ -2871,7 +2885,7 @@
           </w:tcPr>
           <w:p>
             <w:pPr>
-              <w:pStyle w:val="893"/>
+              <w:pStyle w:val="895"/>
               <w:widowControl w:val="true"/>
               <w:pBdr/>
               <w:spacing w:after="0" w:before="0" w:line="240" w:lineRule="auto"/>
@@ -2919,7 +2933,7 @@
           </w:tcPr>
           <w:p>
             <w:pPr>
-              <w:pStyle w:val="893"/>
+              <w:pStyle w:val="895"/>
               <w:widowControl w:val="true"/>
               <w:pBdr/>
               <w:spacing w:after="0" w:before="0" w:line="240" w:lineRule="auto"/>
@@ -2972,7 +2986,7 @@
           </w:tcPr>
           <w:p>
             <w:pPr>
-              <w:pStyle w:val="893"/>
+              <w:pStyle w:val="895"/>
               <w:widowControl w:val="true"/>
               <w:pBdr/>
               <w:spacing w:after="0" w:before="0" w:line="240" w:lineRule="auto"/>
@@ -3020,7 +3034,7 @@
           </w:tcPr>
           <w:p>
             <w:pPr>
-              <w:pStyle w:val="893"/>
+              <w:pStyle w:val="895"/>
               <w:widowControl w:val="true"/>
               <w:pBdr/>
               <w:spacing w:after="0" w:before="0" w:line="240" w:lineRule="auto"/>
@@ -3068,7 +3082,7 @@
           </w:tcPr>
           <w:p>
             <w:pPr>
-              <w:pStyle w:val="893"/>
+              <w:pStyle w:val="895"/>
               <w:widowControl w:val="true"/>
               <w:pBdr/>
               <w:spacing w:after="0" w:before="0" w:line="240" w:lineRule="auto"/>
@@ -3116,7 +3130,7 @@
           </w:tcPr>
           <w:p>
             <w:pPr>
-              <w:pStyle w:val="893"/>
+              <w:pStyle w:val="895"/>
               <w:widowControl w:val="true"/>
               <w:pBdr/>
               <w:spacing w:after="0" w:before="0" w:line="240" w:lineRule="auto"/>
@@ -3164,7 +3178,7 @@
           </w:tcPr>
           <w:p>
             <w:pPr>
-              <w:pStyle w:val="893"/>
+              <w:pStyle w:val="895"/>
               <w:widowControl w:val="true"/>
               <w:pBdr/>
               <w:spacing w:after="0" w:before="0" w:line="240" w:lineRule="auto"/>
@@ -3212,7 +3226,7 @@
           </w:tcPr>
           <w:p>
             <w:pPr>
-              <w:pStyle w:val="893"/>
+              <w:pStyle w:val="895"/>
               <w:widowControl w:val="true"/>
               <w:pBdr/>
               <w:spacing w:after="0" w:before="0" w:line="240" w:lineRule="auto"/>
@@ -3255,7 +3269,7 @@
     </w:tbl>
     <w:p>
       <w:pPr>
-        <w:pStyle w:val="893"/>
+        <w:pStyle w:val="895"/>
         <w:pBdr/>
         <w:spacing/>
         <w:ind/>
@@ -3266,7 +3280,7 @@
     </w:p>
     <w:p>
       <w:pPr>
-        <w:pStyle w:val="893"/>
+        <w:pStyle w:val="895"/>
         <w:pBdr/>
         <w:spacing/>
         <w:ind/>
@@ -3277,7 +3291,7 @@
     </w:p>
     <w:p>
       <w:pPr>
-        <w:pStyle w:val="893"/>
+        <w:pStyle w:val="895"/>
         <w:pBdr/>
         <w:spacing/>
         <w:ind/>
@@ -3288,7 +3302,7 @@
     </w:p>
     <w:p>
       <w:pPr>
-        <w:pStyle w:val="894"/>
+        <w:pStyle w:val="896"/>
         <w:pBdr/>
         <w:spacing/>
         <w:ind/>
@@ -3351,7 +3365,7 @@
                         <w:txbxContent>
                           <w:p>
                             <w:pPr>
-                              <w:pStyle w:val="963"/>
+                              <w:pStyle w:val="965"/>
                               <w:pBdr/>
                               <w:spacing w:after="160" w:before="0"/>
                               <w:ind/>
@@ -3397,7 +3411,7 @@
                   <w:txbxContent>
                     <w:p>
                       <w:pPr>
-                        <w:pStyle w:val="963"/>
+                        <w:pStyle w:val="965"/>
                         <w:pBdr/>
                         <w:spacing w:after="160" w:before="0"/>
                         <w:ind/>
@@ -3438,7 +3452,7 @@
     </w:p>
     <w:p>
       <w:pPr>
-        <w:pStyle w:val="893"/>
+        <w:pStyle w:val="895"/>
         <w:pBdr/>
         <w:spacing/>
         <w:ind/>
@@ -3449,7 +3463,7 @@
     </w:p>
     <w:p>
       <w:pPr>
-        <w:pStyle w:val="896"/>
+        <w:pStyle w:val="898"/>
         <w:pBdr/>
         <w:spacing/>
         <w:ind/>
@@ -3512,7 +3526,7 @@
                         <w:txbxContent>
                           <w:p>
                             <w:pPr>
-                              <w:pStyle w:val="963"/>
+                              <w:pStyle w:val="965"/>
                               <w:pBdr/>
                               <w:spacing/>
                               <w:ind/>
@@ -3541,7 +3555,7 @@
                           </w:p>
                           <w:p>
                             <w:pPr>
-                              <w:pStyle w:val="963"/>
+                              <w:pStyle w:val="965"/>
                               <w:pBdr/>
                               <w:spacing w:after="160" w:before="0"/>
                               <w:ind/>
@@ -3587,7 +3601,7 @@
                   <w:txbxContent>
                     <w:p>
                       <w:pPr>
-                        <w:pStyle w:val="963"/>
+                        <w:pStyle w:val="965"/>
                         <w:pBdr/>
                         <w:spacing/>
                         <w:ind/>
@@ -3616,7 +3630,7 @@
                     </w:p>
                     <w:p>
                       <w:pPr>
-                        <w:pStyle w:val="963"/>
+                        <w:pStyle w:val="965"/>
                         <w:pBdr/>
                         <w:spacing w:after="160" w:before="0"/>
                         <w:ind/>
@@ -3724,7 +3738,7 @@
     </w:p>
     <w:p>
       <w:pPr>
-        <w:pStyle w:val="893"/>
+        <w:pStyle w:val="895"/>
         <w:pBdr/>
         <w:spacing/>
         <w:ind/>
@@ -3787,7 +3801,7 @@
                         <w:txbxContent>
                           <w:p>
                             <w:pPr>
-                              <w:pStyle w:val="963"/>
+                              <w:pStyle w:val="965"/>
                               <w:pBdr/>
                               <w:shd w:val="clear" w:color="196b24" w:themeColor="accent3" w:fill="196b24" w:themeFill="accent3"/>
                               <w:spacing w:after="160" w:before="0"/>
@@ -3822,7 +3836,7 @@
                   <w:txbxContent>
                     <w:p>
                       <w:pPr>
-                        <w:pStyle w:val="963"/>
+                        <w:pStyle w:val="965"/>
                         <w:pBdr/>
                         <w:shd w:val="clear" w:color="196b24" w:themeColor="accent3" w:fill="196b24" w:themeFill="accent3"/>
                         <w:spacing w:after="160" w:before="0"/>
@@ -3924,7 +3938,7 @@
     </w:p>
     <w:p>
       <w:pPr>
-        <w:pStyle w:val="896"/>
+        <w:pStyle w:val="898"/>
         <w:pBdr/>
         <w:spacing/>
         <w:ind/>
@@ -4028,7 +4042,7 @@
     </w:p>
     <w:p>
       <w:pPr>
-        <w:pStyle w:val="896"/>
+        <w:pStyle w:val="898"/>
         <w:pBdr/>
         <w:spacing/>
         <w:ind/>
@@ -4127,7 +4141,7 @@
     </w:p>
     <w:p>
       <w:pPr>
-        <w:pStyle w:val="893"/>
+        <w:pStyle w:val="895"/>
         <w:pBdr/>
         <w:spacing/>
         <w:ind/>
@@ -4190,7 +4204,7 @@
                         <w:txbxContent>
                           <w:p>
                             <w:pPr>
-                              <w:pStyle w:val="963"/>
+                              <w:pStyle w:val="965"/>
                               <w:pBdr/>
                               <w:spacing w:after="160" w:before="0"/>
                               <w:ind/>
@@ -4243,7 +4257,7 @@
                   <w:txbxContent>
                     <w:p>
                       <w:pPr>
-                        <w:pStyle w:val="963"/>
+                        <w:pStyle w:val="965"/>
                         <w:pBdr/>
                         <w:spacing w:after="160" w:before="0"/>
                         <w:ind/>
@@ -4288,7 +4302,7 @@
     </w:p>
     <w:p>
       <w:pPr>
-        <w:pStyle w:val="893"/>
+        <w:pStyle w:val="895"/>
         <w:pBdr/>
         <w:spacing/>
         <w:ind/>
@@ -4299,7 +4313,7 @@
     </w:p>
     <w:p>
       <w:pPr>
-        <w:pStyle w:val="893"/>
+        <w:pStyle w:val="895"/>
         <w:pBdr/>
         <w:spacing/>
         <w:ind/>
@@ -4362,7 +4376,7 @@
                         <w:txbxContent>
                           <w:p>
                             <w:pPr>
-                              <w:pStyle w:val="963"/>
+                              <w:pStyle w:val="965"/>
                               <w:pBdr/>
                               <w:spacing w:after="160" w:before="0"/>
                               <w:ind/>
@@ -4408,7 +4422,7 @@
                   <w:txbxContent>
                     <w:p>
                       <w:pPr>
-                        <w:pStyle w:val="963"/>
+                        <w:pStyle w:val="965"/>
                         <w:pBdr/>
                         <w:spacing w:after="160" w:before="0"/>
                         <w:ind/>
@@ -4521,7 +4535,7 @@
     </w:p>
     <w:p>
       <w:pPr>
-        <w:pStyle w:val="893"/>
+        <w:pStyle w:val="895"/>
         <w:pBdr/>
         <w:spacing/>
         <w:ind/>
@@ -4532,7 +4546,7 @@
     </w:p>
     <w:p>
       <w:pPr>
-        <w:pStyle w:val="893"/>
+        <w:pStyle w:val="895"/>
         <w:pBdr/>
         <w:spacing/>
         <w:ind/>
@@ -4595,7 +4609,7 @@
                         <w:txbxContent>
                           <w:p>
                             <w:pPr>
-                              <w:pStyle w:val="963"/>
+                              <w:pStyle w:val="965"/>
                               <w:pBdr/>
                               <w:spacing w:after="160" w:before="0"/>
                               <w:ind/>
@@ -4641,7 +4655,7 @@
                   <w:txbxContent>
                     <w:p>
                       <w:pPr>
-                        <w:pStyle w:val="963"/>
+                        <w:pStyle w:val="965"/>
                         <w:pBdr/>
                         <w:spacing w:after="160" w:before="0"/>
                         <w:ind/>
@@ -4730,7 +4744,7 @@
                         <w:txbxContent>
                           <w:p>
                             <w:pPr>
-                              <w:pStyle w:val="963"/>
+                              <w:pStyle w:val="965"/>
                               <w:pBdr/>
                               <w:spacing w:after="160" w:before="0"/>
                               <w:ind/>
@@ -4776,7 +4790,7 @@
                   <w:txbxContent>
                     <w:p>
                       <w:pPr>
-                        <w:pStyle w:val="963"/>
+                        <w:pStyle w:val="965"/>
                         <w:pBdr/>
                         <w:spacing w:after="160" w:before="0"/>
                         <w:ind/>
@@ -4889,7 +4903,7 @@
     </w:p>
     <w:p>
       <w:pPr>
-        <w:pStyle w:val="896"/>
+        <w:pStyle w:val="898"/>
         <w:pBdr/>
         <w:spacing/>
         <w:ind/>
@@ -4988,7 +5002,7 @@
     </w:p>
     <w:p>
       <w:pPr>
-        <w:pStyle w:val="893"/>
+        <w:pStyle w:val="895"/>
         <w:pBdr/>
         <w:spacing/>
         <w:ind/>
@@ -5145,7 +5159,7 @@
     </w:p>
     <w:p>
       <w:pPr>
-        <w:pStyle w:val="896"/>
+        <w:pStyle w:val="898"/>
         <w:pBdr/>
         <w:spacing/>
         <w:ind/>
@@ -5214,7 +5228,7 @@
                         <w:txbxContent>
                           <w:p>
                             <w:pPr>
-                              <w:pStyle w:val="963"/>
+                              <w:pStyle w:val="965"/>
                               <w:pBdr/>
                               <w:shd w:val="clear" w:color="196b24" w:themeColor="accent3" w:fill="196b24" w:themeFill="accent3"/>
                               <w:spacing w:after="160" w:before="0"/>
@@ -5249,7 +5263,7 @@
                   <w:txbxContent>
                     <w:p>
                       <w:pPr>
-                        <w:pStyle w:val="963"/>
+                        <w:pStyle w:val="965"/>
                         <w:pBdr/>
                         <w:shd w:val="clear" w:color="196b24" w:themeColor="accent3" w:fill="196b24" w:themeFill="accent3"/>
                         <w:spacing w:after="160" w:before="0"/>
@@ -5287,7 +5301,7 @@
     </w:p>
     <w:p>
       <w:pPr>
-        <w:pStyle w:val="893"/>
+        <w:pStyle w:val="895"/>
         <w:pBdr/>
         <w:spacing/>
         <w:ind/>
@@ -5369,7 +5383,7 @@
     </w:p>
     <w:p>
       <w:pPr>
-        <w:pStyle w:val="896"/>
+        <w:pStyle w:val="898"/>
         <w:pBdr/>
         <w:spacing/>
         <w:ind/>
@@ -5398,7 +5412,7 @@
     </w:p>
     <w:p>
       <w:pPr>
-        <w:pStyle w:val="896"/>
+        <w:pStyle w:val="898"/>
         <w:pBdr/>
         <w:spacing/>
         <w:ind/>
@@ -5501,7 +5515,7 @@
     </w:p>
     <w:p>
       <w:pPr>
-        <w:pStyle w:val="893"/>
+        <w:pStyle w:val="895"/>
         <w:pBdr/>
         <w:spacing/>
         <w:ind/>
@@ -5564,7 +5578,7 @@
                         <w:txbxContent>
                           <w:p>
                             <w:pPr>
-                              <w:pStyle w:val="963"/>
+                              <w:pStyle w:val="965"/>
                               <w:pBdr/>
                               <w:spacing w:after="160" w:before="0"/>
                               <w:ind/>
@@ -5610,7 +5624,7 @@
                   <w:txbxContent>
                     <w:p>
                       <w:pPr>
-                        <w:pStyle w:val="963"/>
+                        <w:pStyle w:val="965"/>
                         <w:pBdr/>
                         <w:spacing w:after="160" w:before="0"/>
                         <w:ind/>
@@ -5699,7 +5713,7 @@
                         <w:txbxContent>
                           <w:p>
                             <w:pPr>
-                              <w:pStyle w:val="963"/>
+                              <w:pStyle w:val="965"/>
                               <w:pBdr/>
                               <w:spacing w:after="160" w:before="0"/>
                               <w:ind/>
@@ -5745,7 +5759,7 @@
                   <w:txbxContent>
                     <w:p>
                       <w:pPr>
-                        <w:pStyle w:val="963"/>
+                        <w:pStyle w:val="965"/>
                         <w:pBdr/>
                         <w:spacing w:after="160" w:before="0"/>
                         <w:ind/>
@@ -5783,7 +5797,7 @@
     </w:p>
     <w:p>
       <w:pPr>
-        <w:pStyle w:val="896"/>
+        <w:pStyle w:val="898"/>
         <w:pBdr/>
         <w:spacing/>
         <w:ind/>
@@ -5812,7 +5826,7 @@
     </w:p>
     <w:p>
       <w:pPr>
-        <w:pStyle w:val="896"/>
+        <w:pStyle w:val="898"/>
         <w:pBdr/>
         <w:spacing/>
         <w:ind/>
@@ -5841,7 +5855,7 @@
     </w:p>
     <w:p>
       <w:pPr>
-        <w:pStyle w:val="896"/>
+        <w:pStyle w:val="898"/>
         <w:pBdr/>
         <w:spacing/>
         <w:ind/>
@@ -5871,7 +5885,7 @@
     </w:p>
     <w:p>
       <w:pPr>
-        <w:pStyle w:val="893"/>
+        <w:pStyle w:val="895"/>
         <w:pBdr/>
         <w:spacing/>
         <w:ind/>
@@ -5907,7 +5921,7 @@
     </w:p>
     <w:p>
       <w:pPr>
-        <w:pStyle w:val="896"/>
+        <w:pStyle w:val="898"/>
         <w:pBdr/>
         <w:spacing/>
         <w:ind/>
@@ -5937,7 +5951,7 @@
     </w:p>
     <w:p>
       <w:pPr>
-        <w:pStyle w:val="893"/>
+        <w:pStyle w:val="895"/>
         <w:pBdr/>
         <w:spacing/>
         <w:ind/>
@@ -5985,7 +5999,7 @@
     </w:p>
     <w:p>
       <w:pPr>
-        <w:pStyle w:val="896"/>
+        <w:pStyle w:val="898"/>
         <w:pBdr/>
         <w:spacing/>
         <w:ind/>
@@ -6001,7 +6015,7 @@
     </w:p>
     <w:p>
       <w:pPr>
-        <w:pStyle w:val="955"/>
+        <w:pStyle w:val="957"/>
         <w:numPr>
           <w:ilvl w:val="0"/>
           <w:numId w:val="1"/>
@@ -6022,7 +6036,7 @@
     </w:p>
     <w:p>
       <w:pPr>
-        <w:pStyle w:val="955"/>
+        <w:pStyle w:val="957"/>
         <w:numPr>
           <w:ilvl w:val="0"/>
           <w:numId w:val="1"/>
@@ -6055,7 +6069,7 @@
     </w:p>
     <w:p>
       <w:pPr>
-        <w:pStyle w:val="955"/>
+        <w:pStyle w:val="957"/>
         <w:numPr>
           <w:ilvl w:val="0"/>
           <w:numId w:val="1"/>
@@ -6076,7 +6090,7 @@
     </w:p>
     <w:p>
       <w:pPr>
-        <w:pStyle w:val="955"/>
+        <w:pStyle w:val="957"/>
         <w:numPr>
           <w:ilvl w:val="0"/>
           <w:numId w:val="1"/>
@@ -6097,7 +6111,7 @@
     </w:p>
     <w:p>
       <w:pPr>
-        <w:pStyle w:val="955"/>
+        <w:pStyle w:val="957"/>
         <w:numPr>
           <w:ilvl w:val="0"/>
           <w:numId w:val="1"/>
@@ -6113,7 +6127,7 @@
     </w:p>
     <w:p>
       <w:pPr>
-        <w:pStyle w:val="896"/>
+        <w:pStyle w:val="898"/>
         <w:pBdr/>
         <w:spacing/>
         <w:ind/>
@@ -6129,7 +6143,7 @@
     </w:p>
     <w:p>
       <w:pPr>
-        <w:pStyle w:val="896"/>
+        <w:pStyle w:val="898"/>
         <w:pBdr/>
         <w:spacing/>
         <w:ind/>
@@ -6145,7 +6159,7 @@
     </w:p>
     <w:p>
       <w:pPr>
-        <w:pStyle w:val="893"/>
+        <w:pStyle w:val="895"/>
         <w:pBdr/>
         <w:spacing/>
         <w:ind/>
@@ -6191,7 +6205,7 @@
     </w:p>
     <w:p>
       <w:pPr>
-        <w:pStyle w:val="893"/>
+        <w:pStyle w:val="895"/>
         <w:pBdr/>
         <w:spacing/>
         <w:ind/>
@@ -6221,7 +6235,7 @@
     </w:p>
     <w:p>
       <w:pPr>
-        <w:pStyle w:val="896"/>
+        <w:pStyle w:val="898"/>
         <w:pBdr/>
         <w:spacing/>
         <w:ind/>
@@ -6237,7 +6251,7 @@
     </w:p>
     <w:p>
       <w:pPr>
-        <w:pStyle w:val="894"/>
+        <w:pStyle w:val="896"/>
         <w:pBdr/>
         <w:spacing/>
         <w:ind/>
@@ -6250,7 +6264,7 @@
     </w:p>
     <w:p>
       <w:pPr>
-        <w:pStyle w:val="893"/>
+        <w:pStyle w:val="895"/>
         <w:pBdr/>
         <w:spacing/>
         <w:ind/>
@@ -6261,7 +6275,7 @@
     </w:p>
     <w:p>
       <w:pPr>
-        <w:pStyle w:val="894"/>
+        <w:pStyle w:val="896"/>
         <w:pBdr/>
         <w:spacing/>
         <w:ind/>
@@ -6274,7 +6288,7 @@
     </w:p>
     <w:p>
       <w:pPr>
-        <w:pStyle w:val="893"/>
+        <w:pStyle w:val="895"/>
         <w:pBdr/>
         <w:spacing/>
         <w:ind/>
@@ -6293,7 +6307,7 @@
     </w:p>
     <w:p>
       <w:pPr>
-        <w:pStyle w:val="893"/>
+        <w:pStyle w:val="895"/>
         <w:pBdr/>
         <w:spacing/>
         <w:ind/>
@@ -6318,7 +6332,7 @@
     </w:p>
     <w:p>
       <w:pPr>
-        <w:pStyle w:val="893"/>
+        <w:pStyle w:val="895"/>
         <w:pBdr/>
         <w:spacing/>
         <w:ind/>
@@ -6334,7 +6348,7 @@
     </w:p>
     <w:p>
       <w:pPr>
-        <w:pStyle w:val="893"/>
+        <w:pStyle w:val="895"/>
         <w:pBdr/>
         <w:spacing/>
         <w:ind/>
@@ -6356,7 +6370,7 @@
     </w:p>
     <w:p>
       <w:pPr>
-        <w:pStyle w:val="896"/>
+        <w:pStyle w:val="898"/>
         <w:pBdr/>
         <w:spacing/>
         <w:ind/>
@@ -6369,7 +6383,7 @@
     </w:p>
     <w:p>
       <w:pPr>
-        <w:pStyle w:val="893"/>
+        <w:pStyle w:val="895"/>
         <w:pBdr/>
         <w:spacing/>
         <w:ind/>
@@ -6391,7 +6405,7 @@
     </w:p>
     <w:p>
       <w:pPr>
-        <w:pStyle w:val="896"/>
+        <w:pStyle w:val="898"/>
         <w:pBdr/>
         <w:spacing/>
         <w:ind/>
@@ -6404,7 +6418,7 @@
     </w:p>
     <w:p>
       <w:pPr>
-        <w:pStyle w:val="893"/>
+        <w:pStyle w:val="895"/>
         <w:pBdr/>
         <w:spacing/>
         <w:ind/>
@@ -6417,7 +6431,7 @@
     </w:p>
     <w:p>
       <w:pPr>
-        <w:pStyle w:val="894"/>
+        <w:pStyle w:val="896"/>
         <w:pBdr/>
         <w:spacing/>
         <w:ind/>
@@ -6430,7 +6444,7 @@
     </w:p>
     <w:p>
       <w:pPr>
-        <w:pStyle w:val="893"/>
+        <w:pStyle w:val="895"/>
         <w:pBdr/>
         <w:spacing/>
         <w:ind/>
@@ -6464,7 +6478,7 @@
     </w:p>
     <w:p>
       <w:pPr>
-        <w:pStyle w:val="893"/>
+        <w:pStyle w:val="895"/>
         <w:pBdr/>
         <w:spacing/>
         <w:ind/>
@@ -6480,7 +6494,7 @@
     </w:p>
     <w:p>
       <w:pPr>
-        <w:pStyle w:val="893"/>
+        <w:pStyle w:val="895"/>
         <w:pBdr/>
         <w:spacing/>
         <w:ind/>
@@ -6502,7 +6516,7 @@
     </w:p>
     <w:p>
       <w:pPr>
-        <w:pStyle w:val="893"/>
+        <w:pStyle w:val="895"/>
         <w:pBdr/>
         <w:spacing/>
         <w:ind/>
@@ -6513,7 +6527,7 @@
     </w:p>
     <w:p>
       <w:pPr>
-        <w:pStyle w:val="893"/>
+        <w:pStyle w:val="895"/>
         <w:pBdr/>
         <w:spacing/>
         <w:ind/>
@@ -6524,7 +6538,7 @@
     </w:p>
     <w:p>
       <w:pPr>
-        <w:pStyle w:val="894"/>
+        <w:pStyle w:val="896"/>
         <w:pBdr/>
         <w:spacing/>
         <w:ind/>
@@ -6537,7 +6551,7 @@
     </w:p>
     <w:p>
       <w:pPr>
-        <w:pStyle w:val="894"/>
+        <w:pStyle w:val="896"/>
         <w:pBdr/>
         <w:bidi w:val="false"/>
         <w:spacing/>
@@ -6554,7 +6568,7 @@
     </w:p>
     <w:p>
       <w:pPr>
-        <w:pStyle w:val="955"/>
+        <w:pStyle w:val="957"/>
         <w:numPr>
           <w:ilvl w:val="0"/>
           <w:numId w:val="3"/>
@@ -6575,7 +6589,7 @@
     </w:p>
     <w:p>
       <w:pPr>
-        <w:pStyle w:val="955"/>
+        <w:pStyle w:val="957"/>
         <w:numPr>
           <w:ilvl w:val="0"/>
           <w:numId w:val="3"/>
@@ -6597,7 +6611,7 @@
     </w:p>
     <w:p>
       <w:pPr>
-        <w:pStyle w:val="955"/>
+        <w:pStyle w:val="957"/>
         <w:numPr>
           <w:ilvl w:val="0"/>
           <w:numId w:val="3"/>
@@ -6625,7 +6639,7 @@
     </w:p>
     <w:p>
       <w:pPr>
-        <w:pStyle w:val="955"/>
+        <w:pStyle w:val="957"/>
         <w:numPr>
           <w:ilvl w:val="0"/>
           <w:numId w:val="3"/>
@@ -6653,7 +6667,7 @@
     </w:p>
     <w:p>
       <w:pPr>
-        <w:pStyle w:val="955"/>
+        <w:pStyle w:val="957"/>
         <w:numPr>
           <w:ilvl w:val="0"/>
           <w:numId w:val="3"/>
@@ -6675,7 +6689,7 @@
     </w:p>
     <w:p>
       <w:pPr>
-        <w:pStyle w:val="955"/>
+        <w:pStyle w:val="957"/>
         <w:numPr>
           <w:ilvl w:val="0"/>
           <w:numId w:val="3"/>
@@ -6703,22 +6717,36 @@
     </w:p>
     <w:p>
       <w:pPr>
-        <w:pStyle w:val="955"/>
-        <w:numPr>
-          <w:ilvl w:val="0"/>
-          <w:numId w:val="3"/>
-        </w:numPr>
         <w:pBdr/>
         <w:bidi w:val="false"/>
         <w:spacing/>
-        <w:ind/>
+        <w:ind w:firstLine="0" w:left="709"/>
         <w:rPr/>
+      </w:pPr>
+      <w:r/>
+      <w:r/>
+      <w:r/>
+    </w:p>
+    <w:p>
+      <w:pPr>
+        <w:pStyle w:val="895"/>
+        <w:widowControl w:val="true"/>
+        <w:pBdr/>
+        <w:bidi w:val="false"/>
+        <w:spacing w:after="160" w:afterAutospacing="0" w:before="0" w:beforeAutospacing="0" w:line="300" w:lineRule="auto"/>
+        <w:ind w:firstLine="0" w:left="0"/>
+        <w:jc w:val="left"/>
+        <w:rPr>
+          <w:highlight w:val="none"/>
+          <w:lang w:val="en"/>
+        </w:rPr>
       </w:pPr>
       <w:r>
         <w:rPr>
           <w:highlight w:val="none"/>
           <w:lang w:val="en"/>
         </w:rPr>
+        <w:t xml:space="preserve">To note before submiting:</w:t>
       </w:r>
       <w:r>
         <w:rPr>
@@ -6732,6 +6760,174 @@
           <w:lang w:val="en"/>
         </w:rPr>
       </w:r>
+    </w:p>
+    <w:p>
+      <w:pPr>
+        <w:pStyle w:val="895"/>
+        <w:widowControl w:val="true"/>
+        <w:numPr>
+          <w:ilvl w:val="0"/>
+          <w:numId w:val="4"/>
+        </w:numPr>
+        <w:pBdr/>
+        <w:bidi w:val="false"/>
+        <w:spacing w:after="160" w:afterAutospacing="0" w:before="0" w:beforeAutospacing="0" w:line="300" w:lineRule="auto"/>
+        <w:ind/>
+        <w:jc w:val="left"/>
+        <w:rPr>
+          <w:highlight w:val="none"/>
+          <w:lang w:val="en"/>
+        </w:rPr>
+      </w:pPr>
+      <w:r>
+        <w:rPr>
+          <w:highlight w:val="none"/>
+          <w:lang w:val="en"/>
+        </w:rPr>
+        <w:t xml:space="preserve">Word count total includes everything</w:t>
+      </w:r>
+      <w:r>
+        <w:rPr>
+          <w:highlight w:val="none"/>
+          <w:lang w:val="en"/>
+        </w:rPr>
+      </w:r>
+      <w:r>
+        <w:rPr>
+          <w:highlight w:val="none"/>
+          <w:lang w:val="en"/>
+        </w:rPr>
+      </w:r>
+    </w:p>
+    <w:p>
+      <w:pPr>
+        <w:pStyle w:val="895"/>
+        <w:widowControl w:val="true"/>
+        <w:numPr>
+          <w:ilvl w:val="0"/>
+          <w:numId w:val="4"/>
+        </w:numPr>
+        <w:pBdr/>
+        <w:bidi w:val="false"/>
+        <w:spacing w:after="160" w:afterAutospacing="0" w:before="0" w:beforeAutospacing="0" w:line="300" w:lineRule="auto"/>
+        <w:ind/>
+        <w:jc w:val="left"/>
+        <w:rPr>
+          <w:highlight w:val="none"/>
+          <w:lang w:val="en"/>
+        </w:rPr>
+      </w:pPr>
+      <w:r>
+        <w:rPr>
+          <w:highlight w:val="none"/>
+          <w:lang w:val="en"/>
+        </w:rPr>
+        <w:t xml:space="preserve">Include page numbers </w:t>
+      </w:r>
+      <w:r>
+        <w:rPr>
+          <w:highlight w:val="none"/>
+          <w:lang w:val="en"/>
+        </w:rPr>
+      </w:r>
+      <w:r>
+        <w:rPr>
+          <w:highlight w:val="none"/>
+          <w:lang w:val="en"/>
+        </w:rPr>
+      </w:r>
+    </w:p>
+    <w:p>
+      <w:pPr>
+        <w:pStyle w:val="895"/>
+        <w:widowControl w:val="true"/>
+        <w:numPr>
+          <w:ilvl w:val="0"/>
+          <w:numId w:val="4"/>
+        </w:numPr>
+        <w:pBdr/>
+        <w:bidi w:val="false"/>
+        <w:spacing w:after="160" w:afterAutospacing="0" w:before="0" w:beforeAutospacing="0" w:line="300" w:lineRule="auto"/>
+        <w:ind/>
+        <w:jc w:val="left"/>
+        <w:rPr>
+          <w:highlight w:val="none"/>
+          <w:lang w:val="en"/>
+        </w:rPr>
+      </w:pPr>
+      <w:r>
+        <w:rPr>
+          <w:highlight w:val="none"/>
+          <w:lang w:val="en"/>
+        </w:rPr>
+        <w:t xml:space="preserve">Put title in proper format </w:t>
+      </w:r>
+      <w:r>
+        <w:rPr>
+          <w:highlight w:val="none"/>
+          <w:lang w:val="en"/>
+        </w:rPr>
+      </w:r>
+      <w:r>
+        <w:rPr>
+          <w:highlight w:val="none"/>
+          <w:lang w:val="en"/>
+        </w:rPr>
+      </w:r>
+    </w:p>
+    <w:p>
+      <w:pPr>
+        <w:pStyle w:val="895"/>
+        <w:widowControl w:val="true"/>
+        <w:numPr>
+          <w:ilvl w:val="0"/>
+          <w:numId w:val="4"/>
+        </w:numPr>
+        <w:pBdr/>
+        <w:bidi w:val="false"/>
+        <w:spacing w:after="160" w:afterAutospacing="0" w:before="0" w:beforeAutospacing="0" w:line="300" w:lineRule="auto"/>
+        <w:ind/>
+        <w:jc w:val="left"/>
+        <w:rPr>
+          <w:highlight w:val="none"/>
+          <w:lang w:val="en"/>
+        </w:rPr>
+      </w:pPr>
+      <w:r>
+        <w:rPr>
+          <w:highlight w:val="none"/>
+          <w:lang w:val="en"/>
+        </w:rPr>
+        <w:t xml:space="preserve">Include licences for included software librareis </w:t>
+      </w:r>
+      <w:r>
+        <w:rPr>
+          <w:highlight w:val="none"/>
+          <w:lang w:val="en"/>
+        </w:rPr>
+      </w:r>
+      <w:r>
+        <w:rPr>
+          <w:highlight w:val="none"/>
+          <w:lang w:val="en"/>
+        </w:rPr>
+      </w:r>
+    </w:p>
+    <w:p>
+      <w:pPr>
+        <w:pBdr/>
+        <w:bidi w:val="false"/>
+        <w:spacing/>
+        <w:ind w:firstLine="0" w:left="709"/>
+        <w:rPr/>
+      </w:pPr>
+      <w:r>
+        <w:rPr>
+          <w:highlight w:val="none"/>
+          <w:lang w:val="en"/>
+        </w:rPr>
+      </w:r>
+      <w:r/>
     </w:p>
     <w:sectPr>
       <w:headerReference w:type="default" r:id="rId9"/>
@@ -6818,7 +7014,7 @@
         </w:tcPr>
         <w:p>
           <w:pPr>
-            <w:pStyle w:val="958"/>
+            <w:pStyle w:val="960"/>
             <w:pBdr/>
             <w:spacing/>
             <w:ind w:left="-115"/>
@@ -6837,7 +7033,7 @@
         </w:tcPr>
         <w:p>
           <w:pPr>
-            <w:pStyle w:val="958"/>
+            <w:pStyle w:val="960"/>
             <w:pBdr/>
             <w:spacing/>
             <w:ind/>
@@ -6857,7 +7053,7 @@
         </w:tcPr>
         <w:p>
           <w:pPr>
-            <w:pStyle w:val="958"/>
+            <w:pStyle w:val="960"/>
             <w:pBdr/>
             <w:spacing/>
             <w:ind w:right="-115"/>
@@ -6872,7 +7068,7 @@
   </w:tbl>
   <w:p>
     <w:pPr>
-      <w:pStyle w:val="959"/>
+      <w:pStyle w:val="961"/>
       <w:pBdr/>
       <w:spacing/>
       <w:ind/>
@@ -6888,7 +7084,7 @@
 <w:ftr xmlns:wpc="http://schemas.microsoft.com/office/word/2010/wordprocessingCanvas" xmlns:mc="http://schemas.openxmlformats.org/markup-compatibility/2006" xmlns:o="urn:schemas-microsoft-com:office:office" xmlns:r="http://schemas.openxmlformats.org/officeDocument/2006/relationships" xmlns:m="http://schemas.openxmlformats.org/officeDocument/2006/math" xmlns:v="urn:schemas-microsoft-com:vml" xmlns:wp14="http://schemas.microsoft.com/office/word/2010/wordprocessingDrawing" xmlns:wp="http://schemas.openxmlformats.org/drawingml/2006/wordprocessingDrawing" xmlns:w10="urn:schemas-microsoft-com:office:word" xmlns:w="http://schemas.openxmlformats.org/wordprocessingml/2006/main" xmlns:w14="http://schemas.microsoft.com/office/word/2010/wordml" xmlns:w15="http://schemas.microsoft.com/office/word/2012/wordml" xmlns:wpg="http://schemas.microsoft.com/office/word/2010/wordprocessingGroup" xmlns:wpi="http://schemas.microsoft.com/office/word/2010/wordprocessingInk" xmlns:wne="http://schemas.microsoft.com/office/word/2006/wordml" xmlns:a="http://schemas.openxmlformats.org/drawingml/2006/main" xmlns:wps="http://schemas.microsoft.com/office/word/2010/wordprocessingShape" mc:Ignorable="w14 w15 wp14">
   <w:p>
     <w:pPr>
-      <w:pStyle w:val="959"/>
+      <w:pStyle w:val="961"/>
       <w:pBdr/>
       <w:spacing/>
       <w:ind/>
@@ -6934,7 +7130,7 @@
         </w:tcPr>
         <w:p>
           <w:pPr>
-            <w:pStyle w:val="958"/>
+            <w:pStyle w:val="960"/>
             <w:pBdr/>
             <w:spacing/>
             <w:ind w:left="-115"/>
@@ -6953,7 +7149,7 @@
         </w:tcPr>
         <w:p>
           <w:pPr>
-            <w:pStyle w:val="958"/>
+            <w:pStyle w:val="960"/>
             <w:pBdr/>
             <w:spacing/>
             <w:ind/>
@@ -6973,7 +7169,7 @@
         </w:tcPr>
         <w:p>
           <w:pPr>
-            <w:pStyle w:val="958"/>
+            <w:pStyle w:val="960"/>
             <w:pBdr/>
             <w:spacing/>
             <w:ind w:right="-115"/>
@@ -6988,7 +7184,7 @@
   </w:tbl>
   <w:p>
     <w:pPr>
-      <w:pStyle w:val="959"/>
+      <w:pStyle w:val="961"/>
       <w:pBdr/>
       <w:spacing/>
       <w:ind/>
@@ -7067,7 +7263,7 @@
         </w:tcPr>
         <w:p>
           <w:pPr>
-            <w:pStyle w:val="958"/>
+            <w:pStyle w:val="960"/>
             <w:pBdr/>
             <w:spacing/>
             <w:ind w:left="-115"/>
@@ -7086,7 +7282,7 @@
         </w:tcPr>
         <w:p>
           <w:pPr>
-            <w:pStyle w:val="958"/>
+            <w:pStyle w:val="960"/>
             <w:pBdr/>
             <w:spacing/>
             <w:ind/>
@@ -7106,7 +7302,7 @@
         </w:tcPr>
         <w:p>
           <w:pPr>
-            <w:pStyle w:val="958"/>
+            <w:pStyle w:val="960"/>
             <w:pBdr/>
             <w:spacing/>
             <w:ind w:right="-115"/>
@@ -7121,7 +7317,7 @@
   </w:tbl>
   <w:p>
     <w:pPr>
-      <w:pStyle w:val="958"/>
+      <w:pStyle w:val="960"/>
       <w:pBdr/>
       <w:spacing/>
       <w:ind/>
@@ -7137,7 +7333,7 @@
 <w:hdr xmlns:wpc="http://schemas.microsoft.com/office/word/2010/wordprocessingCanvas" xmlns:mc="http://schemas.openxmlformats.org/markup-compatibility/2006" xmlns:o="urn:schemas-microsoft-com:office:office" xmlns:r="http://schemas.openxmlformats.org/officeDocument/2006/relationships" xmlns:m="http://schemas.openxmlformats.org/officeDocument/2006/math" xmlns:v="urn:schemas-microsoft-com:vml" xmlns:wp14="http://schemas.microsoft.com/office/word/2010/wordprocessingDrawing" xmlns:wp="http://schemas.openxmlformats.org/drawingml/2006/wordprocessingDrawing" xmlns:w10="urn:schemas-microsoft-com:office:word" xmlns:w="http://schemas.openxmlformats.org/wordprocessingml/2006/main" xmlns:w14="http://schemas.microsoft.com/office/word/2010/wordml" xmlns:w15="http://schemas.microsoft.com/office/word/2012/wordml" xmlns:wpg="http://schemas.microsoft.com/office/word/2010/wordprocessingGroup" xmlns:wpi="http://schemas.microsoft.com/office/word/2010/wordprocessingInk" xmlns:wne="http://schemas.microsoft.com/office/word/2006/wordml" xmlns:a="http://schemas.openxmlformats.org/drawingml/2006/main" xmlns:wps="http://schemas.microsoft.com/office/word/2010/wordprocessingShape" mc:Ignorable="w14 w15 wp14">
   <w:p>
     <w:pPr>
-      <w:pStyle w:val="958"/>
+      <w:pStyle w:val="960"/>
       <w:pBdr/>
       <w:spacing/>
       <w:ind/>
@@ -7183,7 +7379,7 @@
         </w:tcPr>
         <w:p>
           <w:pPr>
-            <w:pStyle w:val="958"/>
+            <w:pStyle w:val="960"/>
             <w:pBdr/>
             <w:spacing/>
             <w:ind w:left="-115"/>
@@ -7202,7 +7398,7 @@
         </w:tcPr>
         <w:p>
           <w:pPr>
-            <w:pStyle w:val="958"/>
+            <w:pStyle w:val="960"/>
             <w:pBdr/>
             <w:spacing/>
             <w:ind/>
@@ -7222,7 +7418,7 @@
         </w:tcPr>
         <w:p>
           <w:pPr>
-            <w:pStyle w:val="958"/>
+            <w:pStyle w:val="960"/>
             <w:pBdr/>
             <w:spacing/>
             <w:ind w:right="-115"/>
@@ -7237,7 +7433,7 @@
   </w:tbl>
   <w:p>
     <w:pPr>
-      <w:pStyle w:val="958"/>
+      <w:pStyle w:val="960"/>
       <w:pBdr/>
       <w:spacing/>
       <w:ind/>
@@ -7726,6 +7922,153 @@
       <w:suff w:val="tab"/>
     </w:lvl>
   </w:abstractNum>
+  <w:abstractNum w:abstractNumId="3">
+    <w:nsid w:val="3671C078"/>
+    <w:lvl w:ilvl="0">
+      <w:isLgl w:val="false"/>
+      <w:lvlJc w:val="left"/>
+      <w:lvlText w:val="·"/>
+      <w:numFmt w:val="bullet"/>
+      <w:pPr>
+        <w:pBdr/>
+        <w:spacing/>
+        <w:ind w:hanging="360" w:left="709"/>
+      </w:pPr>
+      <w:rPr>
+        <w:rFonts w:hint="default" w:ascii="Symbol" w:hAnsi="Symbol" w:eastAsia="Symbol" w:cs="Symbol"/>
+      </w:rPr>
+      <w:start w:val="1"/>
+      <w:suff w:val="tab"/>
+    </w:lvl>
+    <w:lvl w:ilvl="1">
+      <w:isLgl w:val="false"/>
+      <w:lvlJc w:val="left"/>
+      <w:lvlText w:val="o"/>
+      <w:numFmt w:val="bullet"/>
+      <w:pPr>
+        <w:pBdr/>
+        <w:spacing/>
+        <w:ind w:hanging="360" w:left="1429"/>
+      </w:pPr>
+      <w:rPr>
+        <w:rFonts w:hint="default" w:ascii="Courier New" w:hAnsi="Courier New" w:eastAsia="Courier New" w:cs="Courier New"/>
+      </w:rPr>
+      <w:start w:val="1"/>
+      <w:suff w:val="tab"/>
+    </w:lvl>
+    <w:lvl w:ilvl="2">
+      <w:isLgl w:val="false"/>
+      <w:lvlJc w:val="left"/>
+      <w:lvlText w:val="§"/>
+      <w:numFmt w:val="bullet"/>
+      <w:pPr>
+        <w:pBdr/>
+        <w:spacing/>
+        <w:ind w:hanging="360" w:left="2149"/>
+      </w:pPr>
+      <w:rPr>
+        <w:rFonts w:hint="default" w:ascii="Wingdings" w:hAnsi="Wingdings" w:eastAsia="Wingdings" w:cs="Wingdings"/>
+      </w:rPr>
+      <w:start w:val="1"/>
+      <w:suff w:val="tab"/>
+    </w:lvl>
+    <w:lvl w:ilvl="3">
+      <w:isLgl w:val="false"/>
+      <w:lvlJc w:val="left"/>
+      <w:lvlText w:val="·"/>
+      <w:numFmt w:val="bullet"/>
+      <w:pPr>
+        <w:pBdr/>
+        <w:spacing/>
+        <w:ind w:hanging="360" w:left="2869"/>
+      </w:pPr>
+      <w:rPr>
+        <w:rFonts w:hint="default" w:ascii="Symbol" w:hAnsi="Symbol" w:eastAsia="Symbol" w:cs="Symbol"/>
+      </w:rPr>
+      <w:start w:val="1"/>
+      <w:suff w:val="tab"/>
+    </w:lvl>
+    <w:lvl w:ilvl="4">
+      <w:isLgl w:val="false"/>
+      <w:lvlJc w:val="left"/>
+      <w:lvlText w:val="o"/>
+      <w:numFmt w:val="bullet"/>
+      <w:pPr>
+        <w:pBdr/>
+        <w:spacing/>
+        <w:ind w:hanging="360" w:left="3589"/>
+      </w:pPr>
+      <w:rPr>
+        <w:rFonts w:hint="default" w:ascii="Courier New" w:hAnsi="Courier New" w:eastAsia="Courier New" w:cs="Courier New"/>
+      </w:rPr>
+      <w:start w:val="1"/>
+      <w:suff w:val="tab"/>
+    </w:lvl>
+    <w:lvl w:ilvl="5">
+      <w:isLgl w:val="false"/>
+      <w:lvlJc w:val="left"/>
+      <w:lvlText w:val="§"/>
+      <w:numFmt w:val="bullet"/>
+      <w:pPr>
+        <w:pBdr/>
+        <w:spacing/>
+        <w:ind w:hanging="360" w:left="4309"/>
+      </w:pPr>
+      <w:rPr>
+        <w:rFonts w:hint="default" w:ascii="Wingdings" w:hAnsi="Wingdings" w:eastAsia="Wingdings" w:cs="Wingdings"/>
+      </w:rPr>
+      <w:start w:val="1"/>
+      <w:suff w:val="tab"/>
+    </w:lvl>
+    <w:lvl w:ilvl="6">
+      <w:isLgl w:val="false"/>
+      <w:lvlJc w:val="left"/>
+      <w:lvlText w:val="·"/>
+      <w:numFmt w:val="bullet"/>
+      <w:pPr>
+        <w:pBdr/>
+        <w:spacing/>
+        <w:ind w:hanging="360" w:left="5029"/>
+      </w:pPr>
+      <w:rPr>
+        <w:rFonts w:hint="default" w:ascii="Symbol" w:hAnsi="Symbol" w:eastAsia="Symbol" w:cs="Symbol"/>
+      </w:rPr>
+      <w:start w:val="1"/>
+      <w:suff w:val="tab"/>
+    </w:lvl>
+    <w:lvl w:ilvl="7">
+      <w:isLgl w:val="false"/>
+      <w:lvlJc w:val="left"/>
+      <w:lvlText w:val="o"/>
+      <w:numFmt w:val="bullet"/>
+      <w:pPr>
+        <w:pBdr/>
+        <w:spacing/>
+        <w:ind w:hanging="360" w:left="5749"/>
+      </w:pPr>
+      <w:rPr>
+        <w:rFonts w:hint="default" w:ascii="Courier New" w:hAnsi="Courier New" w:eastAsia="Courier New" w:cs="Courier New"/>
+      </w:rPr>
+      <w:start w:val="1"/>
+      <w:suff w:val="tab"/>
+    </w:lvl>
+    <w:lvl w:ilvl="8">
+      <w:isLgl w:val="false"/>
+      <w:lvlJc w:val="left"/>
+      <w:lvlText w:val="§"/>
+      <w:numFmt w:val="bullet"/>
+      <w:pPr>
+        <w:pBdr/>
+        <w:spacing/>
+        <w:ind w:hanging="360" w:left="6469"/>
+      </w:pPr>
+      <w:rPr>
+        <w:rFonts w:hint="default" w:ascii="Wingdings" w:hAnsi="Wingdings" w:eastAsia="Wingdings" w:cs="Wingdings"/>
+      </w:rPr>
+      <w:start w:val="1"/>
+      <w:suff w:val="tab"/>
+    </w:lvl>
+  </w:abstractNum>
   <w:num w:numId="1">
     <w:abstractNumId w:val="0"/>
   </w:num>
@@ -7734,6 +8077,9 @@
   </w:num>
   <w:num w:numId="3">
     <w:abstractNumId w:val="2"/>
+  </w:num>
+  <w:num w:numId="4">
+    <w:abstractNumId w:val="3"/>
   </w:num>
 </w:numbering>
 </file>
@@ -7896,7 +8242,7 @@
     <w:lsdException w:name="Bibliography" w:uiPriority="37"/>
     <w:lsdException w:name="TOC Heading" w:uiPriority="39" w:qFormat="1"/>
   </w:latentStyles>
-  <w:style w:type="paragraph" w:styleId="893" w:default="1">
+  <w:style w:type="paragraph" w:styleId="895" w:default="1">
     <w:name w:val="Normal"/>
     <w:qFormat/>
     <w:pPr>
@@ -7915,11 +8261,11 @@
       <w:lang w:val="en-GB" w:eastAsia="en-US" w:bidi="ar-SA"/>
     </w:rPr>
   </w:style>
-  <w:style w:type="paragraph" w:styleId="894">
+  <w:style w:type="paragraph" w:styleId="896">
     <w:name w:val="Heading 1"/>
-    <w:basedOn w:val="893"/>
-    <w:next w:val="893"/>
-    <w:link w:val="914"/>
+    <w:basedOn w:val="895"/>
+    <w:next w:val="895"/>
+    <w:link w:val="916"/>
     <w:uiPriority w:val="9"/>
     <w:qFormat/>
     <w:pPr>
@@ -7938,11 +8284,11 @@
       <w:szCs w:val="40"/>
     </w:rPr>
   </w:style>
-  <w:style w:type="paragraph" w:styleId="895">
+  <w:style w:type="paragraph" w:styleId="897">
     <w:name w:val="Heading 2"/>
-    <w:basedOn w:val="893"/>
-    <w:next w:val="893"/>
-    <w:link w:val="915"/>
+    <w:basedOn w:val="895"/>
+    <w:next w:val="895"/>
+    <w:link w:val="917"/>
     <w:uiPriority w:val="9"/>
     <w:unhideWhenUsed/>
     <w:qFormat/>
@@ -7961,11 +8307,11 @@
       <w:szCs w:val="32"/>
     </w:rPr>
   </w:style>
-  <w:style w:type="paragraph" w:styleId="896">
+  <w:style w:type="paragraph" w:styleId="898">
     <w:name w:val="Heading 3"/>
-    <w:basedOn w:val="893"/>
-    <w:next w:val="893"/>
-    <w:link w:val="916"/>
+    <w:basedOn w:val="895"/>
+    <w:next w:val="895"/>
+    <w:link w:val="918"/>
     <w:uiPriority w:val="9"/>
     <w:unhideWhenUsed/>
     <w:qFormat/>
@@ -7983,11 +8329,11 @@
       <w:szCs w:val="32"/>
     </w:rPr>
   </w:style>
-  <w:style w:type="paragraph" w:styleId="897">
+  <w:style w:type="paragraph" w:styleId="899">
     <w:name w:val="Heading 4"/>
-    <w:basedOn w:val="893"/>
-    <w:next w:val="893"/>
-    <w:link w:val="917"/>
+    <w:basedOn w:val="895"/>
+    <w:next w:val="895"/>
+    <w:link w:val="919"/>
     <w:uiPriority w:val="9"/>
     <w:unhideWhenUsed/>
     <w:qFormat/>
@@ -8007,11 +8353,11 @@
       <w:szCs w:val="30"/>
     </w:rPr>
   </w:style>
-  <w:style w:type="paragraph" w:styleId="898">
+  <w:style w:type="paragraph" w:styleId="900">
     <w:name w:val="Heading 5"/>
-    <w:basedOn w:val="893"/>
-    <w:next w:val="893"/>
-    <w:link w:val="918"/>
+    <w:basedOn w:val="895"/>
+    <w:next w:val="895"/>
+    <w:link w:val="920"/>
     <w:uiPriority w:val="9"/>
     <w:semiHidden/>
     <w:unhideWhenUsed/>
@@ -8030,11 +8376,11 @@
       <w:szCs w:val="28"/>
     </w:rPr>
   </w:style>
-  <w:style w:type="paragraph" w:styleId="899">
+  <w:style w:type="paragraph" w:styleId="901">
     <w:name w:val="Heading 6"/>
-    <w:basedOn w:val="893"/>
-    <w:next w:val="893"/>
-    <w:link w:val="919"/>
+    <w:basedOn w:val="895"/>
+    <w:next w:val="895"/>
+    <w:link w:val="921"/>
     <w:uiPriority w:val="9"/>
     <w:semiHidden/>
     <w:unhideWhenUsed/>
@@ -8055,11 +8401,11 @@
       <w:szCs w:val="26"/>
     </w:rPr>
   </w:style>
-  <w:style w:type="paragraph" w:styleId="900">
+  <w:style w:type="paragraph" w:styleId="902">
     <w:name w:val="Heading 7"/>
-    <w:basedOn w:val="893"/>
-    <w:next w:val="893"/>
-    <w:link w:val="920"/>
+    <w:basedOn w:val="895"/>
+    <w:next w:val="895"/>
+    <w:link w:val="922"/>
     <w:uiPriority w:val="9"/>
     <w:semiHidden/>
     <w:unhideWhenUsed/>
@@ -8078,11 +8424,11 @@
       <w:szCs w:val="24"/>
     </w:rPr>
   </w:style>
-  <w:style w:type="paragraph" w:styleId="901">
+  <w:style w:type="paragraph" w:styleId="903">
     <w:name w:val="Heading 8"/>
-    <w:basedOn w:val="893"/>
-    <w:next w:val="893"/>
-    <w:link w:val="921"/>
+    <w:basedOn w:val="895"/>
+    <w:next w:val="895"/>
+    <w:link w:val="923"/>
     <w:uiPriority w:val="9"/>
     <w:semiHidden/>
     <w:unhideWhenUsed/>
@@ -8103,11 +8449,11 @@
       <w:szCs w:val="22"/>
     </w:rPr>
   </w:style>
-  <w:style w:type="paragraph" w:styleId="902">
+  <w:style w:type="paragraph" w:styleId="904">
     <w:name w:val="Heading 9"/>
-    <w:basedOn w:val="893"/>
-    <w:next w:val="893"/>
-    <w:link w:val="922"/>
+    <w:basedOn w:val="895"/>
+    <w:next w:val="895"/>
+    <w:link w:val="924"/>
     <w:uiPriority w:val="9"/>
     <w:semiHidden/>
     <w:unhideWhenUsed/>
@@ -8127,10 +8473,10 @@
       <w:iCs/>
     </w:rPr>
   </w:style>
-  <w:style w:type="character" w:styleId="903">
+  <w:style w:type="character" w:styleId="905">
     <w:name w:val="Header Char"/>
-    <w:basedOn w:val="913"/>
-    <w:link w:val="958"/>
+    <w:basedOn w:val="915"/>
+    <w:link w:val="960"/>
     <w:uiPriority w:val="99"/>
     <w:qFormat/>
     <w:pPr>
@@ -8139,10 +8485,10 @@
       <w:ind/>
     </w:pPr>
   </w:style>
-  <w:style w:type="character" w:styleId="904">
+  <w:style w:type="character" w:styleId="906">
     <w:name w:val="Footer Char"/>
-    <w:basedOn w:val="913"/>
-    <w:link w:val="959"/>
+    <w:basedOn w:val="915"/>
+    <w:link w:val="961"/>
     <w:uiPriority w:val="99"/>
     <w:qFormat/>
     <w:pPr>
@@ -8151,10 +8497,10 @@
       <w:ind/>
     </w:pPr>
   </w:style>
-  <w:style w:type="character" w:styleId="905">
+  <w:style w:type="character" w:styleId="907">
     <w:name w:val="Footnote Text Char"/>
-    <w:basedOn w:val="913"/>
-    <w:link w:val="940"/>
+    <w:basedOn w:val="915"/>
+    <w:link w:val="942"/>
     <w:uiPriority w:val="99"/>
     <w:semiHidden/>
     <w:qFormat/>
@@ -8168,9 +8514,9 @@
       <w:szCs w:val="20"/>
     </w:rPr>
   </w:style>
-  <w:style w:type="character" w:styleId="906">
+  <w:style w:type="character" w:styleId="908">
     <w:name w:val="Footnote Characters"/>
-    <w:basedOn w:val="913"/>
+    <w:basedOn w:val="915"/>
     <w:uiPriority w:val="99"/>
     <w:semiHidden/>
     <w:unhideWhenUsed/>
@@ -8184,7 +8530,7 @@
       <w:vertAlign w:val="superscript"/>
     </w:rPr>
   </w:style>
-  <w:style w:type="character" w:styleId="907">
+  <w:style w:type="character" w:styleId="909">
     <w:name w:val="footnote reference"/>
     <w:pPr>
       <w:pBdr/>
@@ -8195,10 +8541,10 @@
       <w:vertAlign w:val="superscript"/>
     </w:rPr>
   </w:style>
-  <w:style w:type="character" w:styleId="908">
+  <w:style w:type="character" w:styleId="910">
     <w:name w:val="Endnote Text Char"/>
-    <w:basedOn w:val="913"/>
-    <w:link w:val="941"/>
+    <w:basedOn w:val="915"/>
+    <w:link w:val="943"/>
     <w:uiPriority w:val="99"/>
     <w:semiHidden/>
     <w:qFormat/>
@@ -8212,9 +8558,9 @@
       <w:szCs w:val="20"/>
     </w:rPr>
   </w:style>
-  <w:style w:type="character" w:styleId="909">
+  <w:style w:type="character" w:styleId="911">
     <w:name w:val="Endnote Characters"/>
-    <w:basedOn w:val="913"/>
+    <w:basedOn w:val="915"/>
     <w:uiPriority w:val="99"/>
     <w:semiHidden/>
     <w:unhideWhenUsed/>
@@ -8228,7 +8574,7 @@
       <w:vertAlign w:val="superscript"/>
     </w:rPr>
   </w:style>
-  <w:style w:type="character" w:styleId="910">
+  <w:style w:type="character" w:styleId="912">
     <w:name w:val="endnote reference"/>
     <w:pPr>
       <w:pBdr/>
@@ -8239,9 +8585,9 @@
       <w:vertAlign w:val="superscript"/>
     </w:rPr>
   </w:style>
-  <w:style w:type="character" w:styleId="911">
+  <w:style w:type="character" w:styleId="913">
     <w:name w:val="FollowedHyperlink"/>
-    <w:basedOn w:val="913"/>
+    <w:basedOn w:val="915"/>
     <w:uiPriority w:val="99"/>
     <w:semiHidden/>
     <w:unhideWhenUsed/>
@@ -8255,9 +8601,9 @@
       <w:u w:val="single"/>
     </w:rPr>
   </w:style>
-  <w:style w:type="character" w:styleId="912">
+  <w:style w:type="character" w:styleId="914">
     <w:name w:val="Placeholder Text"/>
-    <w:basedOn w:val="913"/>
+    <w:basedOn w:val="915"/>
     <w:uiPriority w:val="99"/>
     <w:semiHidden/>
     <w:qFormat/>
@@ -8270,7 +8616,7 @@
       <w:color w:val="666666"/>
     </w:rPr>
   </w:style>
-  <w:style w:type="character" w:styleId="913" w:default="1">
+  <w:style w:type="character" w:styleId="915" w:default="1">
     <w:name w:val="Default Paragraph Font"/>
     <w:uiPriority w:val="1"/>
     <w:semiHidden/>
@@ -8282,10 +8628,10 @@
       <w:ind/>
     </w:pPr>
   </w:style>
-  <w:style w:type="character" w:styleId="914" w:customStyle="1">
+  <w:style w:type="character" w:styleId="916" w:customStyle="1">
     <w:name w:val="Heading 1 Char"/>
-    <w:basedOn w:val="913"/>
-    <w:link w:val="894"/>
+    <w:basedOn w:val="915"/>
+    <w:link w:val="896"/>
     <w:uiPriority w:val="9"/>
     <w:qFormat/>
     <w:pPr>
@@ -8300,10 +8646,10 @@
       <w:szCs w:val="40"/>
     </w:rPr>
   </w:style>
-  <w:style w:type="character" w:styleId="915" w:customStyle="1">
+  <w:style w:type="character" w:styleId="917" w:customStyle="1">
     <w:name w:val="Heading 2 Char"/>
-    <w:basedOn w:val="913"/>
-    <w:link w:val="895"/>
+    <w:basedOn w:val="915"/>
+    <w:link w:val="897"/>
     <w:uiPriority w:val="9"/>
     <w:qFormat/>
     <w:pPr>
@@ -8317,10 +8663,10 @@
       <w:szCs w:val="32"/>
     </w:rPr>
   </w:style>
-  <w:style w:type="character" w:styleId="916" w:customStyle="1">
+  <w:style w:type="character" w:styleId="918" w:customStyle="1">
     <w:name w:val="Heading 3 Char"/>
-    <w:basedOn w:val="913"/>
-    <w:link w:val="896"/>
+    <w:basedOn w:val="915"/>
+    <w:link w:val="898"/>
     <w:uiPriority w:val="9"/>
     <w:qFormat/>
     <w:pPr>
@@ -8334,10 +8680,10 @@
       <w:szCs w:val="32"/>
     </w:rPr>
   </w:style>
-  <w:style w:type="character" w:styleId="917" w:customStyle="1">
+  <w:style w:type="character" w:styleId="919" w:customStyle="1">
     <w:name w:val="Heading 4 Char"/>
-    <w:basedOn w:val="913"/>
-    <w:link w:val="897"/>
+    <w:basedOn w:val="915"/>
+    <w:link w:val="899"/>
     <w:uiPriority w:val="9"/>
     <w:qFormat/>
     <w:pPr>
@@ -8353,10 +8699,10 @@
       <w:szCs w:val="30"/>
     </w:rPr>
   </w:style>
-  <w:style w:type="character" w:styleId="918" w:customStyle="1">
+  <w:style w:type="character" w:styleId="920" w:customStyle="1">
     <w:name w:val="Heading 5 Char"/>
-    <w:basedOn w:val="913"/>
-    <w:link w:val="898"/>
+    <w:basedOn w:val="915"/>
+    <w:link w:val="900"/>
     <w:uiPriority w:val="9"/>
     <w:semiHidden/>
     <w:qFormat/>
@@ -8371,10 +8717,10 @@
       <w:szCs w:val="28"/>
     </w:rPr>
   </w:style>
-  <w:style w:type="character" w:styleId="919" w:customStyle="1">
+  <w:style w:type="character" w:styleId="921" w:customStyle="1">
     <w:name w:val="Heading 6 Char"/>
-    <w:basedOn w:val="913"/>
-    <w:link w:val="899"/>
+    <w:basedOn w:val="915"/>
+    <w:link w:val="901"/>
     <w:uiPriority w:val="9"/>
     <w:semiHidden/>
     <w:qFormat/>
@@ -8391,10 +8737,10 @@
       <w:szCs w:val="26"/>
     </w:rPr>
   </w:style>
-  <w:style w:type="character" w:styleId="920" w:customStyle="1">
+  <w:style w:type="character" w:styleId="922" w:customStyle="1">
     <w:name w:val="Heading 7 Char"/>
-    <w:basedOn w:val="913"/>
-    <w:link w:val="900"/>
+    <w:basedOn w:val="915"/>
+    <w:link w:val="902"/>
     <w:uiPriority w:val="9"/>
     <w:semiHidden/>
     <w:qFormat/>
@@ -8409,10 +8755,10 @@
       <w:szCs w:val="24"/>
     </w:rPr>
   </w:style>
-  <w:style w:type="character" w:styleId="921" w:customStyle="1">
+  <w:style w:type="character" w:styleId="923" w:customStyle="1">
     <w:name w:val="Heading 8 Char"/>
-    <w:basedOn w:val="913"/>
-    <w:link w:val="901"/>
+    <w:basedOn w:val="915"/>
+    <w:link w:val="903"/>
     <w:uiPriority w:val="9"/>
     <w:semiHidden/>
     <w:qFormat/>
@@ -8429,10 +8775,10 @@
       <w:szCs w:val="22"/>
     </w:rPr>
   </w:style>
-  <w:style w:type="character" w:styleId="922" w:customStyle="1">
+  <w:style w:type="character" w:styleId="924" w:customStyle="1">
     <w:name w:val="Heading 9 Char"/>
-    <w:basedOn w:val="913"/>
-    <w:link w:val="902"/>
+    <w:basedOn w:val="915"/>
+    <w:link w:val="904"/>
     <w:uiPriority w:val="9"/>
     <w:semiHidden/>
     <w:qFormat/>
@@ -8448,10 +8794,10 @@
       <w:iCs/>
     </w:rPr>
   </w:style>
-  <w:style w:type="character" w:styleId="923" w:customStyle="1">
+  <w:style w:type="character" w:styleId="925" w:customStyle="1">
     <w:name w:val="Title Char"/>
-    <w:basedOn w:val="913"/>
-    <w:link w:val="952"/>
+    <w:basedOn w:val="915"/>
+    <w:link w:val="954"/>
     <w:uiPriority w:val="10"/>
     <w:qFormat/>
     <w:pPr>
@@ -8468,10 +8814,10 @@
       <w:szCs w:val="72"/>
     </w:rPr>
   </w:style>
-  <w:style w:type="character" w:styleId="924" w:customStyle="1">
+  <w:style w:type="character" w:styleId="926" w:customStyle="1">
     <w:name w:val="Subtitle Char"/>
-    <w:basedOn w:val="913"/>
-    <w:link w:val="953"/>
+    <w:basedOn w:val="915"/>
+    <w:link w:val="955"/>
     <w:uiPriority w:val="11"/>
     <w:qFormat/>
     <w:pPr>
@@ -8485,10 +8831,10 @@
       <w:szCs w:val="28"/>
     </w:rPr>
   </w:style>
-  <w:style w:type="character" w:styleId="925" w:customStyle="1">
+  <w:style w:type="character" w:styleId="927" w:customStyle="1">
     <w:name w:val="Quote Char"/>
-    <w:basedOn w:val="913"/>
-    <w:link w:val="954"/>
+    <w:basedOn w:val="915"/>
+    <w:link w:val="956"/>
     <w:uiPriority w:val="29"/>
     <w:qFormat/>
     <w:pPr>
@@ -8504,9 +8850,9 @@
       <w:szCs w:val="24"/>
     </w:rPr>
   </w:style>
-  <w:style w:type="character" w:styleId="926">
+  <w:style w:type="character" w:styleId="928">
     <w:name w:val="Intense Emphasis"/>
-    <w:basedOn w:val="913"/>
+    <w:basedOn w:val="915"/>
     <w:uiPriority w:val="21"/>
     <w:qFormat/>
     <w:pPr>
@@ -8522,10 +8868,10 @@
       <w:color w:val="auto"/>
     </w:rPr>
   </w:style>
-  <w:style w:type="character" w:styleId="927" w:customStyle="1">
+  <w:style w:type="character" w:styleId="929" w:customStyle="1">
     <w:name w:val="Intense Quote Char"/>
-    <w:basedOn w:val="913"/>
-    <w:link w:val="956"/>
+    <w:basedOn w:val="915"/>
+    <w:link w:val="958"/>
     <w:uiPriority w:val="30"/>
     <w:qFormat/>
     <w:pPr>
@@ -8541,9 +8887,9 @@
       <w:szCs w:val="28"/>
     </w:rPr>
   </w:style>
-  <w:style w:type="character" w:styleId="928">
+  <w:style w:type="character" w:styleId="930">
     <w:name w:val="Intense Reference"/>
-    <w:basedOn w:val="913"/>
+    <w:basedOn w:val="915"/>
     <w:uiPriority w:val="32"/>
     <w:qFormat/>
     <w:pPr>
@@ -8560,9 +8906,9 @@
       <w:u w:val="single"/>
     </w:rPr>
   </w:style>
-  <w:style w:type="character" w:styleId="929">
+  <w:style w:type="character" w:styleId="931">
     <w:name w:val="Hyperlink"/>
-    <w:basedOn w:val="913"/>
+    <w:basedOn w:val="915"/>
     <w:uiPriority w:val="99"/>
     <w:unhideWhenUsed/>
     <w:pPr>
@@ -8575,9 +8921,9 @@
       <w:u w:val="single"/>
     </w:rPr>
   </w:style>
-  <w:style w:type="character" w:styleId="930">
+  <w:style w:type="character" w:styleId="932">
     <w:name w:val="Strong"/>
-    <w:basedOn w:val="913"/>
+    <w:basedOn w:val="915"/>
     <w:uiPriority w:val="22"/>
     <w:qFormat/>
     <w:pPr>
@@ -8590,9 +8936,9 @@
       <w:bCs/>
     </w:rPr>
   </w:style>
-  <w:style w:type="character" w:styleId="931">
+  <w:style w:type="character" w:styleId="933">
     <w:name w:val="Emphasis"/>
-    <w:basedOn w:val="913"/>
+    <w:basedOn w:val="915"/>
     <w:uiPriority w:val="20"/>
     <w:qFormat/>
     <w:pPr>
@@ -8606,9 +8952,9 @@
       <w:color w:val="000000" w:themeColor="text1"/>
     </w:rPr>
   </w:style>
-  <w:style w:type="character" w:styleId="932">
+  <w:style w:type="character" w:styleId="934">
     <w:name w:val="Subtle Emphasis"/>
-    <w:basedOn w:val="913"/>
+    <w:basedOn w:val="915"/>
     <w:uiPriority w:val="19"/>
     <w:qFormat/>
     <w:pPr>
@@ -8622,9 +8968,9 @@
       <w:color w:val="595959" w:themeColor="text1" w:themeTint="A6"/>
     </w:rPr>
   </w:style>
-  <w:style w:type="character" w:styleId="933">
+  <w:style w:type="character" w:styleId="935">
     <w:name w:val="Subtle Reference"/>
-    <w:basedOn w:val="913"/>
+    <w:basedOn w:val="915"/>
     <w:uiPriority w:val="31"/>
     <w:qFormat/>
     <w:pPr>
@@ -8639,9 +8985,9 @@
       <w:u w:val="single"/>
     </w:rPr>
   </w:style>
-  <w:style w:type="character" w:styleId="934">
+  <w:style w:type="character" w:styleId="936">
     <w:name w:val="Book Title"/>
-    <w:basedOn w:val="913"/>
+    <w:basedOn w:val="915"/>
     <w:uiPriority w:val="33"/>
     <w:qFormat/>
     <w:pPr>
@@ -8656,10 +9002,10 @@
       <w:spacing w:val="0"/>
     </w:rPr>
   </w:style>
-  <w:style w:type="paragraph" w:styleId="935">
+  <w:style w:type="paragraph" w:styleId="937">
     <w:name w:val="Heading"/>
-    <w:basedOn w:val="893"/>
-    <w:next w:val="936"/>
+    <w:basedOn w:val="895"/>
+    <w:next w:val="938"/>
     <w:qFormat/>
     <w:pPr>
       <w:keepNext w:val="true"/>
@@ -8673,18 +9019,18 @@
       <w:szCs w:val="28"/>
     </w:rPr>
   </w:style>
-  <w:style w:type="paragraph" w:styleId="936">
+  <w:style w:type="paragraph" w:styleId="938">
     <w:name w:val="Body Text"/>
-    <w:basedOn w:val="893"/>
+    <w:basedOn w:val="895"/>
     <w:pPr>
       <w:pBdr/>
       <w:spacing w:after="140" w:before="0" w:line="276" w:lineRule="auto"/>
       <w:ind/>
     </w:pPr>
   </w:style>
-  <w:style w:type="paragraph" w:styleId="937">
+  <w:style w:type="paragraph" w:styleId="939">
     <w:name w:val="List"/>
-    <w:basedOn w:val="936"/>
+    <w:basedOn w:val="938"/>
     <w:pPr>
       <w:pBdr/>
       <w:spacing/>
@@ -8694,10 +9040,10 @@
       <w:rFonts w:cs="Noto Sans Devanagari"/>
     </w:rPr>
   </w:style>
-  <w:style w:type="paragraph" w:styleId="938">
+  <w:style w:type="paragraph" w:styleId="940">
     <w:name w:val="Caption"/>
-    <w:basedOn w:val="893"/>
-    <w:next w:val="893"/>
+    <w:basedOn w:val="895"/>
+    <w:next w:val="895"/>
     <w:uiPriority w:val="35"/>
     <w:semiHidden/>
     <w:unhideWhenUsed/>
@@ -8715,9 +9061,9 @@
       <w:szCs w:val="16"/>
     </w:rPr>
   </w:style>
-  <w:style w:type="paragraph" w:styleId="939">
+  <w:style w:type="paragraph" w:styleId="941">
     <w:name w:val="Index"/>
-    <w:basedOn w:val="893"/>
+    <w:basedOn w:val="895"/>
     <w:qFormat/>
     <w:pPr>
       <w:suppressLineNumbers w:val="true"/>
@@ -8729,10 +9075,10 @@
       <w:rFonts w:cs="Noto Sans Devanagari"/>
     </w:rPr>
   </w:style>
-  <w:style w:type="paragraph" w:styleId="940">
+  <w:style w:type="paragraph" w:styleId="942">
     <w:name w:val="footnote text"/>
-    <w:basedOn w:val="893"/>
-    <w:link w:val="905"/>
+    <w:basedOn w:val="895"/>
+    <w:link w:val="907"/>
     <w:uiPriority w:val="99"/>
     <w:semiHidden/>
     <w:unhideWhenUsed/>
@@ -8746,10 +9092,10 @@
       <w:szCs w:val="20"/>
     </w:rPr>
   </w:style>
-  <w:style w:type="paragraph" w:styleId="941">
+  <w:style w:type="paragraph" w:styleId="943">
     <w:name w:val="endnote text"/>
-    <w:basedOn w:val="893"/>
-    <w:link w:val="908"/>
+    <w:basedOn w:val="895"/>
+    <w:link w:val="910"/>
     <w:uiPriority w:val="99"/>
     <w:semiHidden/>
     <w:unhideWhenUsed/>
@@ -8763,10 +9109,10 @@
       <w:szCs w:val="20"/>
     </w:rPr>
   </w:style>
-  <w:style w:type="paragraph" w:styleId="942">
+  <w:style w:type="paragraph" w:styleId="944">
     <w:name w:val="toc 1"/>
-    <w:basedOn w:val="893"/>
-    <w:next w:val="893"/>
+    <w:basedOn w:val="895"/>
+    <w:next w:val="895"/>
     <w:uiPriority w:val="39"/>
     <w:unhideWhenUsed/>
     <w:pPr>
@@ -8775,10 +9121,10 @@
       <w:ind/>
     </w:pPr>
   </w:style>
-  <w:style w:type="paragraph" w:styleId="943">
+  <w:style w:type="paragraph" w:styleId="945">
     <w:name w:val="toc 2"/>
-    <w:basedOn w:val="893"/>
-    <w:next w:val="893"/>
+    <w:basedOn w:val="895"/>
+    <w:next w:val="895"/>
     <w:uiPriority w:val="39"/>
     <w:unhideWhenUsed/>
     <w:pPr>
@@ -8787,10 +9133,10 @@
       <w:ind w:left="220"/>
     </w:pPr>
   </w:style>
-  <w:style w:type="paragraph" w:styleId="944">
+  <w:style w:type="paragraph" w:styleId="946">
     <w:name w:val="toc 3"/>
-    <w:basedOn w:val="893"/>
-    <w:next w:val="893"/>
+    <w:basedOn w:val="895"/>
+    <w:next w:val="895"/>
     <w:uiPriority w:val="39"/>
     <w:unhideWhenUsed/>
     <w:pPr>
@@ -8799,10 +9145,10 @@
       <w:ind w:left="440"/>
     </w:pPr>
   </w:style>
-  <w:style w:type="paragraph" w:styleId="945">
+  <w:style w:type="paragraph" w:styleId="947">
     <w:name w:val="toc 4"/>
-    <w:basedOn w:val="893"/>
-    <w:next w:val="893"/>
+    <w:basedOn w:val="895"/>
+    <w:next w:val="895"/>
     <w:uiPriority w:val="39"/>
     <w:unhideWhenUsed/>
     <w:pPr>
@@ -8811,10 +9157,10 @@
       <w:ind w:left="660"/>
     </w:pPr>
   </w:style>
-  <w:style w:type="paragraph" w:styleId="946">
+  <w:style w:type="paragraph" w:styleId="948">
     <w:name w:val="toc 5"/>
-    <w:basedOn w:val="893"/>
-    <w:next w:val="893"/>
+    <w:basedOn w:val="895"/>
+    <w:next w:val="895"/>
     <w:uiPriority w:val="39"/>
     <w:unhideWhenUsed/>
     <w:pPr>
@@ -8823,10 +9169,10 @@
       <w:ind w:left="880"/>
     </w:pPr>
   </w:style>
-  <w:style w:type="paragraph" w:styleId="947">
+  <w:style w:type="paragraph" w:styleId="949">
     <w:name w:val="toc 6"/>
-    <w:basedOn w:val="893"/>
-    <w:next w:val="893"/>
+    <w:basedOn w:val="895"/>
+    <w:next w:val="895"/>
     <w:uiPriority w:val="39"/>
     <w:unhideWhenUsed/>
     <w:pPr>
@@ -8835,10 +9181,10 @@
       <w:ind w:left="1100"/>
     </w:pPr>
   </w:style>
-  <w:style w:type="paragraph" w:styleId="948">
+  <w:style w:type="paragraph" w:styleId="950">
     <w:name w:val="toc 7"/>
-    <w:basedOn w:val="893"/>
-    <w:next w:val="893"/>
+    <w:basedOn w:val="895"/>
+    <w:next w:val="895"/>
     <w:uiPriority w:val="39"/>
     <w:unhideWhenUsed/>
     <w:pPr>
@@ -8847,10 +9193,10 @@
       <w:ind w:left="1320"/>
     </w:pPr>
   </w:style>
-  <w:style w:type="paragraph" w:styleId="949">
+  <w:style w:type="paragraph" w:styleId="951">
     <w:name w:val="toc 8"/>
-    <w:basedOn w:val="893"/>
-    <w:next w:val="893"/>
+    <w:basedOn w:val="895"/>
+    <w:next w:val="895"/>
     <w:uiPriority w:val="39"/>
     <w:unhideWhenUsed/>
     <w:pPr>
@@ -8859,10 +9205,10 @@
       <w:ind w:left="1540"/>
     </w:pPr>
   </w:style>
-  <w:style w:type="paragraph" w:styleId="950">
+  <w:style w:type="paragraph" w:styleId="952">
     <w:name w:val="toc 9"/>
-    <w:basedOn w:val="893"/>
-    <w:next w:val="893"/>
+    <w:basedOn w:val="895"/>
+    <w:next w:val="895"/>
     <w:uiPriority w:val="39"/>
     <w:unhideWhenUsed/>
     <w:pPr>
@@ -8871,10 +9217,10 @@
       <w:ind w:left="1760"/>
     </w:pPr>
   </w:style>
-  <w:style w:type="paragraph" w:styleId="951">
+  <w:style w:type="paragraph" w:styleId="953">
     <w:name w:val="table of figures"/>
-    <w:basedOn w:val="893"/>
-    <w:next w:val="893"/>
+    <w:basedOn w:val="895"/>
+    <w:next w:val="895"/>
     <w:uiPriority w:val="99"/>
     <w:unhideWhenUsed/>
     <w:pPr>
@@ -8883,11 +9229,11 @@
       <w:ind/>
     </w:pPr>
   </w:style>
-  <w:style w:type="paragraph" w:styleId="952">
+  <w:style w:type="paragraph" w:styleId="954">
     <w:name w:val="Title"/>
-    <w:basedOn w:val="893"/>
-    <w:next w:val="893"/>
-    <w:link w:val="923"/>
+    <w:basedOn w:val="895"/>
+    <w:next w:val="895"/>
+    <w:link w:val="925"/>
     <w:uiPriority w:val="10"/>
     <w:qFormat/>
     <w:pPr>
@@ -8909,11 +9255,11 @@
       <w:szCs w:val="72"/>
     </w:rPr>
   </w:style>
-  <w:style w:type="paragraph" w:styleId="953">
+  <w:style w:type="paragraph" w:styleId="955">
     <w:name w:val="Subtitle"/>
-    <w:basedOn w:val="893"/>
-    <w:next w:val="893"/>
-    <w:link w:val="924"/>
+    <w:basedOn w:val="895"/>
+    <w:next w:val="895"/>
+    <w:link w:val="926"/>
     <w:uiPriority w:val="11"/>
     <w:qFormat/>
     <w:pPr>
@@ -8928,11 +9274,11 @@
       <w:szCs w:val="28"/>
     </w:rPr>
   </w:style>
-  <w:style w:type="paragraph" w:styleId="954">
+  <w:style w:type="paragraph" w:styleId="956">
     <w:name w:val="Quote"/>
-    <w:basedOn w:val="893"/>
-    <w:next w:val="893"/>
-    <w:link w:val="925"/>
+    <w:basedOn w:val="895"/>
+    <w:next w:val="895"/>
+    <w:link w:val="927"/>
     <w:uiPriority w:val="29"/>
     <w:qFormat/>
     <w:pPr>
@@ -8949,9 +9295,9 @@
       <w:szCs w:val="24"/>
     </w:rPr>
   </w:style>
-  <w:style w:type="paragraph" w:styleId="955">
+  <w:style w:type="paragraph" w:styleId="957">
     <w:name w:val="List Paragraph"/>
-    <w:basedOn w:val="893"/>
+    <w:basedOn w:val="895"/>
     <w:uiPriority w:val="34"/>
     <w:qFormat/>
     <w:pPr>
@@ -8961,11 +9307,11 @@
       <w:contextualSpacing w:val="true"/>
     </w:pPr>
   </w:style>
-  <w:style w:type="paragraph" w:styleId="956">
+  <w:style w:type="paragraph" w:styleId="958">
     <w:name w:val="Intense Quote"/>
-    <w:basedOn w:val="893"/>
-    <w:next w:val="893"/>
-    <w:link w:val="927"/>
+    <w:basedOn w:val="895"/>
+    <w:next w:val="895"/>
+    <w:link w:val="929"/>
     <w:uiPriority w:val="30"/>
     <w:qFormat/>
     <w:pPr>
@@ -8982,9 +9328,9 @@
       <w:szCs w:val="28"/>
     </w:rPr>
   </w:style>
-  <w:style w:type="paragraph" w:styleId="957">
+  <w:style w:type="paragraph" w:styleId="959">
     <w:name w:val="Header and Footer"/>
-    <w:basedOn w:val="893"/>
+    <w:basedOn w:val="895"/>
     <w:qFormat/>
     <w:pPr>
       <w:pBdr/>
@@ -8992,9 +9338,9 @@
       <w:ind/>
     </w:pPr>
   </w:style>
-  <w:style w:type="paragraph" w:styleId="958">
+  <w:style w:type="paragraph" w:styleId="960">
     <w:name w:val="Header"/>
-    <w:basedOn w:val="893"/>
+    <w:basedOn w:val="895"/>
     <w:uiPriority w:val="99"/>
     <w:unhideWhenUsed/>
     <w:pPr>
@@ -9008,9 +9354,9 @@
       <w:ind/>
     </w:pPr>
   </w:style>
-  <w:style w:type="paragraph" w:styleId="959">
+  <w:style w:type="paragraph" w:styleId="961">
     <w:name w:val="Footer"/>
-    <w:basedOn w:val="893"/>
+    <w:basedOn w:val="895"/>
     <w:uiPriority w:val="99"/>
     <w:unhideWhenUsed/>
     <w:pPr>
@@ -9024,7 +9370,7 @@
       <w:ind/>
     </w:pPr>
   </w:style>
-  <w:style w:type="paragraph" w:styleId="960">
+  <w:style w:type="paragraph" w:styleId="962">
     <w:name w:val="No Spacing"/>
     <w:uiPriority w:val="1"/>
     <w:qFormat/>
@@ -9044,19 +9390,19 @@
       <w:lang w:val="en-GB" w:eastAsia="en-US" w:bidi="ar-SA"/>
     </w:rPr>
   </w:style>
-  <w:style w:type="paragraph" w:styleId="961">
+  <w:style w:type="paragraph" w:styleId="963">
     <w:name w:val="Index Heading"/>
-    <w:basedOn w:val="935"/>
+    <w:basedOn w:val="937"/>
     <w:pPr>
       <w:pBdr/>
       <w:spacing/>
       <w:ind/>
     </w:pPr>
   </w:style>
-  <w:style w:type="paragraph" w:styleId="962">
+  <w:style w:type="paragraph" w:styleId="964">
     <w:name w:val="TOC Heading"/>
-    <w:basedOn w:val="894"/>
-    <w:next w:val="893"/>
+    <w:basedOn w:val="896"/>
+    <w:next w:val="895"/>
     <w:uiPriority w:val="39"/>
     <w:semiHidden/>
     <w:unhideWhenUsed/>
@@ -9068,9 +9414,9 @@
       <w:outlineLvl w:val="9"/>
     </w:pPr>
   </w:style>
-  <w:style w:type="paragraph" w:styleId="963">
+  <w:style w:type="paragraph" w:styleId="965">
     <w:name w:val="Frame Contents"/>
-    <w:basedOn w:val="893"/>
+    <w:basedOn w:val="895"/>
     <w:qFormat/>
     <w:pPr>
       <w:pBdr/>
@@ -9078,7 +9424,7 @@
       <w:ind/>
     </w:pPr>
   </w:style>
-  <w:style w:type="numbering" w:styleId="964" w:default="1">
+  <w:style w:type="numbering" w:styleId="966" w:default="1">
     <w:name w:val="No List"/>
     <w:uiPriority w:val="99"/>
     <w:semiHidden/>
@@ -9090,9 +9436,9 @@
       <w:ind/>
     </w:pPr>
   </w:style>
-  <w:style w:type="table" w:styleId="965">
+  <w:style w:type="table" w:styleId="967">
     <w:name w:val="Table Grid Light"/>
-    <w:basedOn w:val="1090"/>
+    <w:basedOn w:val="1092"/>
     <w:uiPriority w:val="59"/>
     <w:pPr>
       <w:pBdr/>
@@ -9288,9 +9634,9 @@
       </w:tcPr>
     </w:tblStylePr>
   </w:style>
-  <w:style w:type="table" w:styleId="966">
+  <w:style w:type="table" w:styleId="968">
     <w:name w:val="Plain Table 1"/>
-    <w:basedOn w:val="1090"/>
+    <w:basedOn w:val="1092"/>
     <w:uiPriority w:val="59"/>
     <w:pPr>
       <w:pBdr/>
@@ -9504,9 +9850,9 @@
       </w:tcPr>
     </w:tblStylePr>
   </w:style>
-  <w:style w:type="table" w:styleId="967">
+  <w:style w:type="table" w:styleId="969">
     <w:name w:val="Plain Table 2"/>
-    <w:basedOn w:val="1090"/>
+    <w:basedOn w:val="1092"/>
     <w:uiPriority w:val="59"/>
     <w:pPr>
       <w:pBdr/>
@@ -9728,9 +10074,9 @@
       </w:tcPr>
     </w:tblStylePr>
   </w:style>
-  <w:style w:type="table" w:styleId="968">
+  <w:style w:type="table" w:styleId="970">
     <w:name w:val="Plain Table 3"/>
-    <w:basedOn w:val="1090"/>
+    <w:basedOn w:val="1092"/>
     <w:uiPriority w:val="99"/>
     <w:pPr>
       <w:pBdr/>
@@ -9949,9 +10295,9 @@
       </w:tcPr>
     </w:tblStylePr>
   </w:style>
-  <w:style w:type="table" w:styleId="969">
+  <w:style w:type="table" w:styleId="971">
     <w:name w:val="Plain Table 4"/>
-    <w:basedOn w:val="1090"/>
+    <w:basedOn w:val="1092"/>
     <w:uiPriority w:val="99"/>
     <w:pPr>
       <w:pBdr/>
@@ -10156,9 +10502,9 @@
       </w:tcPr>
     </w:tblStylePr>
   </w:style>
-  <w:style w:type="table" w:styleId="970">
+  <w:style w:type="table" w:styleId="972">
     <w:name w:val="Plain Table 5"/>
-    <w:basedOn w:val="1090"/>
+    <w:basedOn w:val="1092"/>
     <w:uiPriority w:val="99"/>
     <w:pPr>
       <w:pBdr/>
@@ -10380,9 +10726,9 @@
       </w:tcPr>
     </w:tblStylePr>
   </w:style>
-  <w:style w:type="table" w:styleId="971">
+  <w:style w:type="table" w:styleId="973">
     <w:name w:val="Grid Table 1 Light"/>
-    <w:basedOn w:val="1090"/>
+    <w:basedOn w:val="1092"/>
     <w:uiPriority w:val="99"/>
     <w:pPr>
       <w:pBdr/>
@@ -10596,9 +10942,9 @@
       </w:tcPr>
     </w:tblStylePr>
   </w:style>
-  <w:style w:type="table" w:styleId="972">
+  <w:style w:type="table" w:styleId="974">
     <w:name w:val="Grid Table 1 Light - Accent 1"/>
-    <w:basedOn w:val="1090"/>
+    <w:basedOn w:val="1092"/>
     <w:uiPriority w:val="99"/>
     <w:pPr>
       <w:pBdr/>
@@ -10812,9 +11158,9 @@
       </w:tcPr>
     </w:tblStylePr>
   </w:style>
-  <w:style w:type="table" w:styleId="973">
+  <w:style w:type="table" w:styleId="975">
     <w:name w:val="Grid Table 1 Light - Accent 2"/>
-    <w:basedOn w:val="1090"/>
+    <w:basedOn w:val="1092"/>
     <w:uiPriority w:val="99"/>
     <w:pPr>
       <w:pBdr/>
@@ -11028,9 +11374,9 @@
       </w:tcPr>
     </w:tblStylePr>
   </w:style>
-  <w:style w:type="table" w:styleId="974">
+  <w:style w:type="table" w:styleId="976">
     <w:name w:val="Grid Table 1 Light - Accent 3"/>
-    <w:basedOn w:val="1090"/>
+    <w:basedOn w:val="1092"/>
     <w:uiPriority w:val="99"/>
     <w:pPr>
       <w:pBdr/>
@@ -11244,9 +11590,9 @@
       </w:tcPr>
     </w:tblStylePr>
   </w:style>
-  <w:style w:type="table" w:styleId="975">
+  <w:style w:type="table" w:styleId="977">
     <w:name w:val="Grid Table 1 Light - Accent 4"/>
-    <w:basedOn w:val="1090"/>
+    <w:basedOn w:val="1092"/>
     <w:uiPriority w:val="99"/>
     <w:pPr>
       <w:pBdr/>
@@ -11460,9 +11806,9 @@
       </w:tcPr>
     </w:tblStylePr>
   </w:style>
-  <w:style w:type="table" w:styleId="976">
+  <w:style w:type="table" w:styleId="978">
     <w:name w:val="Grid Table 1 Light - Accent 5"/>
-    <w:basedOn w:val="1090"/>
+    <w:basedOn w:val="1092"/>
     <w:uiPriority w:val="99"/>
     <w:pPr>
       <w:pBdr/>
@@ -11676,9 +12022,9 @@
       </w:tcPr>
     </w:tblStylePr>
   </w:style>
-  <w:style w:type="table" w:styleId="977">
+  <w:style w:type="table" w:styleId="979">
     <w:name w:val="Grid Table 1 Light - Accent 6"/>
-    <w:basedOn w:val="1090"/>
+    <w:basedOn w:val="1092"/>
     <w:uiPriority w:val="99"/>
     <w:pPr>
       <w:pBdr/>
@@ -11892,9 +12238,9 @@
       </w:tcPr>
     </w:tblStylePr>
   </w:style>
-  <w:style w:type="table" w:styleId="978">
+  <w:style w:type="table" w:styleId="980">
     <w:name w:val="Grid Table 2"/>
-    <w:basedOn w:val="1090"/>
+    <w:basedOn w:val="1092"/>
     <w:uiPriority w:val="99"/>
     <w:pPr>
       <w:pBdr/>
@@ -12115,9 +12461,9 @@
       </w:tcPr>
     </w:tblStylePr>
   </w:style>
-  <w:style w:type="table" w:styleId="979">
+  <w:style w:type="table" w:styleId="981">
     <w:name w:val="Grid Table 2 - Accent 1"/>
-    <w:basedOn w:val="1090"/>
+    <w:basedOn w:val="1092"/>
     <w:uiPriority w:val="99"/>
     <w:pPr>
       <w:pBdr/>
@@ -12338,9 +12684,9 @@
       </w:tcPr>
     </w:tblStylePr>
   </w:style>
-  <w:style w:type="table" w:styleId="980">
+  <w:style w:type="table" w:styleId="982">
     <w:name w:val="Grid Table 2 - Accent 2"/>
-    <w:basedOn w:val="1090"/>
+    <w:basedOn w:val="1092"/>
     <w:uiPriority w:val="99"/>
     <w:pPr>
       <w:pBdr/>
@@ -12561,9 +12907,9 @@
       </w:tcPr>
     </w:tblStylePr>
   </w:style>
-  <w:style w:type="table" w:styleId="981">
+  <w:style w:type="table" w:styleId="983">
     <w:name w:val="Grid Table 2 - Accent 3"/>
-    <w:basedOn w:val="1090"/>
+    <w:basedOn w:val="1092"/>
     <w:uiPriority w:val="99"/>
     <w:pPr>
       <w:pBdr/>
@@ -12784,9 +13130,9 @@
       </w:tcPr>
     </w:tblStylePr>
   </w:style>
-  <w:style w:type="table" w:styleId="982">
+  <w:style w:type="table" w:styleId="984">
     <w:name w:val="Grid Table 2 - Accent 4"/>
-    <w:basedOn w:val="1090"/>
+    <w:basedOn w:val="1092"/>
     <w:uiPriority w:val="99"/>
     <w:pPr>
       <w:pBdr/>
@@ -13007,9 +13353,9 @@
       </w:tcPr>
     </w:tblStylePr>
   </w:style>
-  <w:style w:type="table" w:styleId="983">
+  <w:style w:type="table" w:styleId="985">
     <w:name w:val="Grid Table 2 - Accent 5"/>
-    <w:basedOn w:val="1090"/>
+    <w:basedOn w:val="1092"/>
     <w:uiPriority w:val="99"/>
     <w:pPr>
       <w:pBdr/>
@@ -13230,9 +13576,9 @@
       </w:tcPr>
     </w:tblStylePr>
   </w:style>
-  <w:style w:type="table" w:styleId="984">
+  <w:style w:type="table" w:styleId="986">
     <w:name w:val="Grid Table 2 - Accent 6"/>
-    <w:basedOn w:val="1090"/>
+    <w:basedOn w:val="1092"/>
     <w:uiPriority w:val="99"/>
     <w:pPr>
       <w:pBdr/>
@@ -13453,9 +13799,9 @@
       </w:tcPr>
     </w:tblStylePr>
   </w:style>
-  <w:style w:type="table" w:styleId="985">
+  <w:style w:type="table" w:styleId="987">
     <w:name w:val="Grid Table 3"/>
-    <w:basedOn w:val="1090"/>
+    <w:basedOn w:val="1092"/>
     <w:uiPriority w:val="99"/>
     <w:pPr>
       <w:pBdr/>
@@ -13689,9 +14035,9 @@
       </w:tcPr>
     </w:tblStylePr>
   </w:style>
-  <w:style w:type="table" w:styleId="986">
+  <w:style w:type="table" w:styleId="988">
     <w:name w:val="Grid Table 3 - Accent 1"/>
-    <w:basedOn w:val="1090"/>
+    <w:basedOn w:val="1092"/>
     <w:uiPriority w:val="99"/>
     <w:pPr>
       <w:pBdr/>
@@ -13925,9 +14271,9 @@
       </w:tcPr>
     </w:tblStylePr>
   </w:style>
-  <w:style w:type="table" w:styleId="987">
+  <w:style w:type="table" w:styleId="989">
     <w:name w:val="Grid Table 3 - Accent 2"/>
-    <w:basedOn w:val="1090"/>
+    <w:basedOn w:val="1092"/>
     <w:uiPriority w:val="99"/>
     <w:pPr>
       <w:pBdr/>
@@ -14161,9 +14507,9 @@
       </w:tcPr>
     </w:tblStylePr>
   </w:style>
-  <w:style w:type="table" w:styleId="988">
+  <w:style w:type="table" w:styleId="990">
     <w:name w:val="Grid Table 3 - Accent 3"/>
-    <w:basedOn w:val="1090"/>
+    <w:basedOn w:val="1092"/>
     <w:uiPriority w:val="99"/>
     <w:pPr>
       <w:pBdr/>
@@ -14397,9 +14743,9 @@
       </w:tcPr>
     </w:tblStylePr>
   </w:style>
-  <w:style w:type="table" w:styleId="989">
+  <w:style w:type="table" w:styleId="991">
     <w:name w:val="Grid Table 3 - Accent 4"/>
-    <w:basedOn w:val="1090"/>
+    <w:basedOn w:val="1092"/>
     <w:uiPriority w:val="99"/>
     <w:pPr>
       <w:pBdr/>
@@ -14633,9 +14979,9 @@
       </w:tcPr>
     </w:tblStylePr>
   </w:style>
-  <w:style w:type="table" w:styleId="990">
+  <w:style w:type="table" w:styleId="992">
     <w:name w:val="Grid Table 3 - Accent 5"/>
-    <w:basedOn w:val="1090"/>
+    <w:basedOn w:val="1092"/>
     <w:uiPriority w:val="99"/>
     <w:pPr>
       <w:pBdr/>
@@ -14869,9 +15215,9 @@
       </w:tcPr>
     </w:tblStylePr>
   </w:style>
-  <w:style w:type="table" w:styleId="991">
+  <w:style w:type="table" w:styleId="993">
     <w:name w:val="Grid Table 3 - Accent 6"/>
-    <w:basedOn w:val="1090"/>
+    <w:basedOn w:val="1092"/>
     <w:uiPriority w:val="99"/>
     <w:pPr>
       <w:pBdr/>
@@ -15105,9 +15451,9 @@
       </w:tcPr>
     </w:tblStylePr>
   </w:style>
-  <w:style w:type="table" w:styleId="992">
+  <w:style w:type="table" w:styleId="994">
     <w:name w:val="Grid Table 4"/>
-    <w:basedOn w:val="1090"/>
+    <w:basedOn w:val="1092"/>
     <w:uiPriority w:val="59"/>
     <w:pPr>
       <w:pBdr/>
@@ -15328,9 +15674,9 @@
       </w:tcPr>
     </w:tblStylePr>
   </w:style>
-  <w:style w:type="table" w:styleId="993">
+  <w:style w:type="table" w:styleId="995">
     <w:name w:val="Grid Table 4 - Accent 1"/>
-    <w:basedOn w:val="1090"/>
+    <w:basedOn w:val="1092"/>
     <w:uiPriority w:val="59"/>
     <w:pPr>
       <w:pBdr/>
@@ -15551,9 +15897,9 @@
       </w:tcPr>
     </w:tblStylePr>
   </w:style>
-  <w:style w:type="table" w:styleId="994">
+  <w:style w:type="table" w:styleId="996">
     <w:name w:val="Grid Table 4 - Accent 2"/>
-    <w:basedOn w:val="1090"/>
+    <w:basedOn w:val="1092"/>
     <w:uiPriority w:val="59"/>
     <w:pPr>
       <w:pBdr/>
@@ -15774,9 +16120,9 @@
       </w:tcPr>
     </w:tblStylePr>
   </w:style>
-  <w:style w:type="table" w:styleId="995">
+  <w:style w:type="table" w:styleId="997">
     <w:name w:val="Grid Table 4 - Accent 3"/>
-    <w:basedOn w:val="1090"/>
+    <w:basedOn w:val="1092"/>
     <w:uiPriority w:val="59"/>
     <w:pPr>
       <w:pBdr/>
@@ -15997,9 +16343,9 @@
       </w:tcPr>
     </w:tblStylePr>
   </w:style>
-  <w:style w:type="table" w:styleId="996">
+  <w:style w:type="table" w:styleId="998">
     <w:name w:val="Grid Table 4 - Accent 4"/>
-    <w:basedOn w:val="1090"/>
+    <w:basedOn w:val="1092"/>
     <w:uiPriority w:val="59"/>
     <w:pPr>
       <w:pBdr/>
@@ -16220,9 +16566,9 @@
       </w:tcPr>
     </w:tblStylePr>
   </w:style>
-  <w:style w:type="table" w:styleId="997">
+  <w:style w:type="table" w:styleId="999">
     <w:name w:val="Grid Table 4 - Accent 5"/>
-    <w:basedOn w:val="1090"/>
+    <w:basedOn w:val="1092"/>
     <w:uiPriority w:val="59"/>
     <w:pPr>
       <w:pBdr/>
@@ -16443,9 +16789,9 @@
       </w:tcPr>
     </w:tblStylePr>
   </w:style>
-  <w:style w:type="table" w:styleId="998">
+  <w:style w:type="table" w:styleId="1000">
     <w:name w:val="Grid Table 4 - Accent 6"/>
-    <w:basedOn w:val="1090"/>
+    <w:basedOn w:val="1092"/>
     <w:uiPriority w:val="59"/>
     <w:pPr>
       <w:pBdr/>
@@ -16666,9 +17012,9 @@
       </w:tcPr>
     </w:tblStylePr>
   </w:style>
-  <w:style w:type="table" w:styleId="999">
+  <w:style w:type="table" w:styleId="1001">
     <w:name w:val="Grid Table 5 Dark"/>
-    <w:basedOn w:val="1090"/>
+    <w:basedOn w:val="1092"/>
     <w:uiPriority w:val="99"/>
     <w:pPr>
       <w:pBdr/>
@@ -16884,9 +17230,9 @@
       </w:tcPr>
     </w:tblStylePr>
   </w:style>
-  <w:style w:type="table" w:styleId="1000">
+  <w:style w:type="table" w:styleId="1002">
     <w:name w:val="Grid Table 5 Dark- Accent 1"/>
-    <w:basedOn w:val="1090"/>
+    <w:basedOn w:val="1092"/>
     <w:uiPriority w:val="99"/>
     <w:pPr>
       <w:pBdr/>
@@ -17102,9 +17448,9 @@
       </w:tcPr>
     </w:tblStylePr>
   </w:style>
-  <w:style w:type="table" w:styleId="1001">
+  <w:style w:type="table" w:styleId="1003">
     <w:name w:val="Grid Table 5 Dark - Accent 2"/>
-    <w:basedOn w:val="1090"/>
+    <w:basedOn w:val="1092"/>
     <w:uiPriority w:val="99"/>
     <w:pPr>
       <w:pBdr/>
@@ -17320,9 +17666,9 @@
       </w:tcPr>
     </w:tblStylePr>
   </w:style>
-  <w:style w:type="table" w:styleId="1002">
+  <w:style w:type="table" w:styleId="1004">
     <w:name w:val="Grid Table 5 Dark - Accent 3"/>
-    <w:basedOn w:val="1090"/>
+    <w:basedOn w:val="1092"/>
     <w:uiPriority w:val="99"/>
     <w:pPr>
       <w:pBdr/>
@@ -17538,9 +17884,9 @@
       </w:tcPr>
     </w:tblStylePr>
   </w:style>
-  <w:style w:type="table" w:styleId="1003">
+  <w:style w:type="table" w:styleId="1005">
     <w:name w:val="Grid Table 5 Dark- Accent 4"/>
-    <w:basedOn w:val="1090"/>
+    <w:basedOn w:val="1092"/>
     <w:uiPriority w:val="99"/>
     <w:pPr>
       <w:pBdr/>
@@ -17756,9 +18102,9 @@
       </w:tcPr>
     </w:tblStylePr>
   </w:style>
-  <w:style w:type="table" w:styleId="1004">
+  <w:style w:type="table" w:styleId="1006">
     <w:name w:val="Grid Table 5 Dark - Accent 5"/>
-    <w:basedOn w:val="1090"/>
+    <w:basedOn w:val="1092"/>
     <w:uiPriority w:val="99"/>
     <w:pPr>
       <w:pBdr/>
@@ -17974,9 +18320,9 @@
       </w:tcPr>
     </w:tblStylePr>
   </w:style>
-  <w:style w:type="table" w:styleId="1005">
+  <w:style w:type="table" w:styleId="1007">
     <w:name w:val="Grid Table 5 Dark - Accent 6"/>
-    <w:basedOn w:val="1090"/>
+    <w:basedOn w:val="1092"/>
     <w:uiPriority w:val="99"/>
     <w:pPr>
       <w:pBdr/>
@@ -18192,9 +18538,9 @@
       </w:tcPr>
     </w:tblStylePr>
   </w:style>
-  <w:style w:type="table" w:styleId="1006">
+  <w:style w:type="table" w:styleId="1008">
     <w:name w:val="Grid Table 6 Colorful"/>
-    <w:basedOn w:val="1090"/>
+    <w:basedOn w:val="1092"/>
     <w:uiPriority w:val="99"/>
     <w:pPr>
       <w:pBdr/>
@@ -18418,9 +18764,9 @@
       </w:tcPr>
     </w:tblStylePr>
   </w:style>
-  <w:style w:type="table" w:styleId="1007">
+  <w:style w:type="table" w:styleId="1009">
     <w:name w:val="Grid Table 6 Colorful - Accent 1"/>
-    <w:basedOn w:val="1090"/>
+    <w:basedOn w:val="1092"/>
     <w:uiPriority w:val="99"/>
     <w:pPr>
       <w:pBdr/>
@@ -18644,9 +18990,9 @@
       </w:tcPr>
     </w:tblStylePr>
   </w:style>
-  <w:style w:type="table" w:styleId="1008">
+  <w:style w:type="table" w:styleId="1010">
     <w:name w:val="Grid Table 6 Colorful - Accent 2"/>
-    <w:basedOn w:val="1090"/>
+    <w:basedOn w:val="1092"/>
     <w:uiPriority w:val="99"/>
     <w:pPr>
       <w:pBdr/>
@@ -18870,9 +19216,9 @@
       </w:tcPr>
     </w:tblStylePr>
   </w:style>
-  <w:style w:type="table" w:styleId="1009">
+  <w:style w:type="table" w:styleId="1011">
     <w:name w:val="Grid Table 6 Colorful - Accent 3"/>
-    <w:basedOn w:val="1090"/>
+    <w:basedOn w:val="1092"/>
     <w:uiPriority w:val="99"/>
     <w:pPr>
       <w:pBdr/>
@@ -19096,9 +19442,9 @@
       </w:tcPr>
     </w:tblStylePr>
   </w:style>
-  <w:style w:type="table" w:styleId="1010">
+  <w:style w:type="table" w:styleId="1012">
     <w:name w:val="Grid Table 6 Colorful - Accent 4"/>
-    <w:basedOn w:val="1090"/>
+    <w:basedOn w:val="1092"/>
     <w:uiPriority w:val="99"/>
     <w:pPr>
       <w:pBdr/>
@@ -19322,9 +19668,9 @@
       </w:tcPr>
     </w:tblStylePr>
   </w:style>
-  <w:style w:type="table" w:styleId="1011">
+  <w:style w:type="table" w:styleId="1013">
     <w:name w:val="Grid Table 6 Colorful - Accent 5"/>
-    <w:basedOn w:val="1090"/>
+    <w:basedOn w:val="1092"/>
     <w:uiPriority w:val="99"/>
     <w:pPr>
       <w:pBdr/>
@@ -19548,9 +19894,9 @@
       </w:tcPr>
     </w:tblStylePr>
   </w:style>
-  <w:style w:type="table" w:styleId="1012">
+  <w:style w:type="table" w:styleId="1014">
     <w:name w:val="Grid Table 6 Colorful - Accent 6"/>
-    <w:basedOn w:val="1090"/>
+    <w:basedOn w:val="1092"/>
     <w:uiPriority w:val="99"/>
     <w:pPr>
       <w:pBdr/>
@@ -19774,9 +20120,9 @@
       </w:tcPr>
     </w:tblStylePr>
   </w:style>
-  <w:style w:type="table" w:styleId="1013">
+  <w:style w:type="table" w:styleId="1015">
     <w:name w:val="Grid Table 7 Colorful"/>
-    <w:basedOn w:val="1090"/>
+    <w:basedOn w:val="1092"/>
     <w:uiPriority w:val="99"/>
     <w:pPr>
       <w:pBdr/>
@@ -20021,9 +20367,9 @@
       </w:tcPr>
     </w:tblStylePr>
   </w:style>
-  <w:style w:type="table" w:styleId="1014">
+  <w:style w:type="table" w:styleId="1016">
     <w:name w:val="Grid Table 7 Colorful - Accent 1"/>
-    <w:basedOn w:val="1090"/>
+    <w:basedOn w:val="1092"/>
     <w:uiPriority w:val="99"/>
     <w:pPr>
       <w:pBdr/>
@@ -20268,9 +20614,9 @@
       </w:tcPr>
     </w:tblStylePr>
   </w:style>
-  <w:style w:type="table" w:styleId="1015">
+  <w:style w:type="table" w:styleId="1017">
     <w:name w:val="Grid Table 7 Colorful - Accent 2"/>
-    <w:basedOn w:val="1090"/>
+    <w:basedOn w:val="1092"/>
     <w:uiPriority w:val="99"/>
     <w:pPr>
       <w:pBdr/>
@@ -20515,9 +20861,9 @@
       </w:tcPr>
     </w:tblStylePr>
   </w:style>
-  <w:style w:type="table" w:styleId="1016">
+  <w:style w:type="table" w:styleId="1018">
     <w:name w:val="Grid Table 7 Colorful - Accent 3"/>
-    <w:basedOn w:val="1090"/>
+    <w:basedOn w:val="1092"/>
     <w:uiPriority w:val="99"/>
     <w:pPr>
       <w:pBdr/>
@@ -20762,9 +21108,9 @@
       </w:tcPr>
     </w:tblStylePr>
   </w:style>
-  <w:style w:type="table" w:styleId="1017">
+  <w:style w:type="table" w:styleId="1019">
     <w:name w:val="Grid Table 7 Colorful - Accent 4"/>
-    <w:basedOn w:val="1090"/>
+    <w:basedOn w:val="1092"/>
     <w:uiPriority w:val="99"/>
     <w:pPr>
       <w:pBdr/>
@@ -21009,9 +21355,9 @@
       </w:tcPr>
     </w:tblStylePr>
   </w:style>
-  <w:style w:type="table" w:styleId="1018">
+  <w:style w:type="table" w:styleId="1020">
     <w:name w:val="Grid Table 7 Colorful - Accent 5"/>
-    <w:basedOn w:val="1090"/>
+    <w:basedOn w:val="1092"/>
     <w:uiPriority w:val="99"/>
     <w:pPr>
       <w:pBdr/>
@@ -21256,9 +21602,9 @@
       </w:tcPr>
     </w:tblStylePr>
   </w:style>
-  <w:style w:type="table" w:styleId="1019">
+  <w:style w:type="table" w:styleId="1021">
     <w:name w:val="Grid Table 7 Colorful - Accent 6"/>
-    <w:basedOn w:val="1090"/>
+    <w:basedOn w:val="1092"/>
     <w:uiPriority w:val="99"/>
     <w:pPr>
       <w:pBdr/>
@@ -21503,9 +21849,9 @@
       </w:tcPr>
     </w:tblStylePr>
   </w:style>
-  <w:style w:type="table" w:styleId="1020">
+  <w:style w:type="table" w:styleId="1022">
     <w:name w:val="List Table 1 Light"/>
-    <w:basedOn w:val="1090"/>
+    <w:basedOn w:val="1092"/>
     <w:uiPriority w:val="99"/>
     <w:pPr>
       <w:pBdr/>
@@ -21714,9 +22060,9 @@
       </w:tcPr>
     </w:tblStylePr>
   </w:style>
-  <w:style w:type="table" w:styleId="1021">
+  <w:style w:type="table" w:styleId="1023">
     <w:name w:val="List Table 1 Light - Accent 1"/>
-    <w:basedOn w:val="1090"/>
+    <w:basedOn w:val="1092"/>
     <w:uiPriority w:val="99"/>
     <w:pPr>
       <w:pBdr/>
@@ -21925,9 +22271,9 @@
       </w:tcPr>
     </w:tblStylePr>
   </w:style>
-  <w:style w:type="table" w:styleId="1022">
+  <w:style w:type="table" w:styleId="1024">
     <w:name w:val="List Table 1 Light - Accent 2"/>
-    <w:basedOn w:val="1090"/>
+    <w:basedOn w:val="1092"/>
     <w:uiPriority w:val="99"/>
     <w:pPr>
       <w:pBdr/>
@@ -22136,9 +22482,9 @@
       </w:tcPr>
     </w:tblStylePr>
   </w:style>
-  <w:style w:type="table" w:styleId="1023">
+  <w:style w:type="table" w:styleId="1025">
     <w:name w:val="List Table 1 Light - Accent 3"/>
-    <w:basedOn w:val="1090"/>
+    <w:basedOn w:val="1092"/>
     <w:uiPriority w:val="99"/>
     <w:pPr>
       <w:pBdr/>
@@ -22347,9 +22693,9 @@
       </w:tcPr>
     </w:tblStylePr>
   </w:style>
-  <w:style w:type="table" w:styleId="1024">
+  <w:style w:type="table" w:styleId="1026">
     <w:name w:val="List Table 1 Light - Accent 4"/>
-    <w:basedOn w:val="1090"/>
+    <w:basedOn w:val="1092"/>
     <w:uiPriority w:val="99"/>
     <w:pPr>
       <w:pBdr/>
@@ -22558,9 +22904,9 @@
       </w:tcPr>
     </w:tblStylePr>
   </w:style>
-  <w:style w:type="table" w:styleId="1025">
+  <w:style w:type="table" w:styleId="1027">
     <w:name w:val="List Table 1 Light - Accent 5"/>
-    <w:basedOn w:val="1090"/>
+    <w:basedOn w:val="1092"/>
     <w:uiPriority w:val="99"/>
     <w:pPr>
       <w:pBdr/>
@@ -22769,9 +23115,9 @@
       </w:tcPr>
     </w:tblStylePr>
   </w:style>
-  <w:style w:type="table" w:styleId="1026">
+  <w:style w:type="table" w:styleId="1028">
     <w:name w:val="List Table 1 Light - Accent 6"/>
-    <w:basedOn w:val="1090"/>
+    <w:basedOn w:val="1092"/>
     <w:uiPriority w:val="99"/>
     <w:pPr>
       <w:pBdr/>
@@ -22980,9 +23326,9 @@
       </w:tcPr>
     </w:tblStylePr>
   </w:style>
-  <w:style w:type="table" w:styleId="1027">
+  <w:style w:type="table" w:styleId="1029">
     <w:name w:val="List Table 2"/>
-    <w:basedOn w:val="1090"/>
+    <w:basedOn w:val="1092"/>
     <w:uiPriority w:val="99"/>
     <w:pPr>
       <w:pBdr/>
@@ -23205,9 +23551,9 @@
       </w:tcPr>
     </w:tblStylePr>
   </w:style>
-  <w:style w:type="table" w:styleId="1028">
+  <w:style w:type="table" w:styleId="1030">
     <w:name w:val="List Table 2 - Accent 1"/>
-    <w:basedOn w:val="1090"/>
+    <w:basedOn w:val="1092"/>
     <w:uiPriority w:val="99"/>
     <w:pPr>
       <w:pBdr/>
@@ -23430,9 +23776,9 @@
       </w:tcPr>
     </w:tblStylePr>
   </w:style>
-  <w:style w:type="table" w:styleId="1029">
+  <w:style w:type="table" w:styleId="1031">
     <w:name w:val="List Table 2 - Accent 2"/>
-    <w:basedOn w:val="1090"/>
+    <w:basedOn w:val="1092"/>
     <w:uiPriority w:val="99"/>
     <w:pPr>
       <w:pBdr/>
@@ -23655,9 +24001,9 @@
       </w:tcPr>
     </w:tblStylePr>
   </w:style>
-  <w:style w:type="table" w:styleId="1030">
+  <w:style w:type="table" w:styleId="1032">
     <w:name w:val="List Table 2 - Accent 3"/>
-    <w:basedOn w:val="1090"/>
+    <w:basedOn w:val="1092"/>
     <w:uiPriority w:val="99"/>
     <w:pPr>
       <w:pBdr/>
@@ -23880,9 +24226,9 @@
       </w:tcPr>
     </w:tblStylePr>
   </w:style>
-  <w:style w:type="table" w:styleId="1031">
+  <w:style w:type="table" w:styleId="1033">
     <w:name w:val="List Table 2 - Accent 4"/>
-    <w:basedOn w:val="1090"/>
+    <w:basedOn w:val="1092"/>
     <w:uiPriority w:val="99"/>
     <w:pPr>
       <w:pBdr/>
@@ -24105,9 +24451,9 @@
       </w:tcPr>
     </w:tblStylePr>
   </w:style>
-  <w:style w:type="table" w:styleId="1032">
+  <w:style w:type="table" w:styleId="1034">
     <w:name w:val="List Table 2 - Accent 5"/>
-    <w:basedOn w:val="1090"/>
+    <w:basedOn w:val="1092"/>
     <w:uiPriority w:val="99"/>
     <w:pPr>
       <w:pBdr/>
@@ -24330,9 +24676,9 @@
       </w:tcPr>
     </w:tblStylePr>
   </w:style>
-  <w:style w:type="table" w:styleId="1033">
+  <w:style w:type="table" w:styleId="1035">
     <w:name w:val="List Table 2 - Accent 6"/>
-    <w:basedOn w:val="1090"/>
+    <w:basedOn w:val="1092"/>
     <w:uiPriority w:val="99"/>
     <w:pPr>
       <w:pBdr/>
@@ -24555,9 +24901,9 @@
       </w:tcPr>
     </w:tblStylePr>
   </w:style>
-  <w:style w:type="table" w:styleId="1034">
+  <w:style w:type="table" w:styleId="1036">
     <w:name w:val="List Table 3"/>
-    <w:basedOn w:val="1090"/>
+    <w:basedOn w:val="1092"/>
     <w:uiPriority w:val="99"/>
     <w:pPr>
       <w:pBdr/>
@@ -24773,9 +25119,9 @@
       </w:tcPr>
     </w:tblStylePr>
   </w:style>
-  <w:style w:type="table" w:styleId="1035">
+  <w:style w:type="table" w:styleId="1037">
     <w:name w:val="List Table 3 - Accent 1"/>
-    <w:basedOn w:val="1090"/>
+    <w:basedOn w:val="1092"/>
     <w:uiPriority w:val="99"/>
     <w:pPr>
       <w:pBdr/>
@@ -24991,9 +25337,9 @@
       </w:tcPr>
     </w:tblStylePr>
   </w:style>
-  <w:style w:type="table" w:styleId="1036">
+  <w:style w:type="table" w:styleId="1038">
     <w:name w:val="List Table 3 - Accent 2"/>
-    <w:basedOn w:val="1090"/>
+    <w:basedOn w:val="1092"/>
     <w:uiPriority w:val="99"/>
     <w:pPr>
       <w:pBdr/>
@@ -25209,9 +25555,9 @@
       </w:tcPr>
     </w:tblStylePr>
   </w:style>
-  <w:style w:type="table" w:styleId="1037">
+  <w:style w:type="table" w:styleId="1039">
     <w:name w:val="List Table 3 - Accent 3"/>
-    <w:basedOn w:val="1090"/>
+    <w:basedOn w:val="1092"/>
     <w:uiPriority w:val="99"/>
     <w:pPr>
       <w:pBdr/>
@@ -25427,9 +25773,9 @@
       </w:tcPr>
     </w:tblStylePr>
   </w:style>
-  <w:style w:type="table" w:styleId="1038">
+  <w:style w:type="table" w:styleId="1040">
     <w:name w:val="List Table 3 - Accent 4"/>
-    <w:basedOn w:val="1090"/>
+    <w:basedOn w:val="1092"/>
     <w:uiPriority w:val="99"/>
     <w:pPr>
       <w:pBdr/>
@@ -25645,9 +25991,9 @@
       </w:tcPr>
     </w:tblStylePr>
   </w:style>
-  <w:style w:type="table" w:styleId="1039">
+  <w:style w:type="table" w:styleId="1041">
     <w:name w:val="List Table 3 - Accent 5"/>
-    <w:basedOn w:val="1090"/>
+    <w:basedOn w:val="1092"/>
     <w:uiPriority w:val="99"/>
     <w:pPr>
       <w:pBdr/>
@@ -25863,9 +26209,9 @@
       </w:tcPr>
     </w:tblStylePr>
   </w:style>
-  <w:style w:type="table" w:styleId="1040">
+  <w:style w:type="table" w:styleId="1042">
     <w:name w:val="List Table 3 - Accent 6"/>
-    <w:basedOn w:val="1090"/>
+    <w:basedOn w:val="1092"/>
     <w:uiPriority w:val="99"/>
     <w:pPr>
       <w:pBdr/>
@@ -26081,9 +26427,9 @@
       </w:tcPr>
     </w:tblStylePr>
   </w:style>
-  <w:style w:type="table" w:styleId="1041">
+  <w:style w:type="table" w:styleId="1043">
     <w:name w:val="List Table 4"/>
-    <w:basedOn w:val="1090"/>
+    <w:basedOn w:val="1092"/>
     <w:uiPriority w:val="99"/>
     <w:pPr>
       <w:pBdr/>
@@ -26296,9 +26642,9 @@
       </w:tcPr>
     </w:tblStylePr>
   </w:style>
-  <w:style w:type="table" w:styleId="1042">
+  <w:style w:type="table" w:styleId="1044">
     <w:name w:val="List Table 4 - Accent 1"/>
-    <w:basedOn w:val="1090"/>
+    <w:basedOn w:val="1092"/>
     <w:uiPriority w:val="99"/>
     <w:pPr>
       <w:pBdr/>
@@ -26511,9 +26857,9 @@
       </w:tcPr>
     </w:tblStylePr>
   </w:style>
-  <w:style w:type="table" w:styleId="1043">
+  <w:style w:type="table" w:styleId="1045">
     <w:name w:val="List Table 4 - Accent 2"/>
-    <w:basedOn w:val="1090"/>
+    <w:basedOn w:val="1092"/>
     <w:uiPriority w:val="99"/>
     <w:pPr>
       <w:pBdr/>
@@ -26726,9 +27072,9 @@
       </w:tcPr>
     </w:tblStylePr>
   </w:style>
-  <w:style w:type="table" w:styleId="1044">
+  <w:style w:type="table" w:styleId="1046">
     <w:name w:val="List Table 4 - Accent 3"/>
-    <w:basedOn w:val="1090"/>
+    <w:basedOn w:val="1092"/>
     <w:uiPriority w:val="99"/>
     <w:pPr>
       <w:pBdr/>
@@ -26941,9 +27287,9 @@
       </w:tcPr>
     </w:tblStylePr>
   </w:style>
-  <w:style w:type="table" w:styleId="1045">
+  <w:style w:type="table" w:styleId="1047">
     <w:name w:val="List Table 4 - Accent 4"/>
-    <w:basedOn w:val="1090"/>
+    <w:basedOn w:val="1092"/>
     <w:uiPriority w:val="99"/>
     <w:pPr>
       <w:pBdr/>
@@ -27156,9 +27502,9 @@
       </w:tcPr>
     </w:tblStylePr>
   </w:style>
-  <w:style w:type="table" w:styleId="1046">
+  <w:style w:type="table" w:styleId="1048">
     <w:name w:val="List Table 4 - Accent 5"/>
-    <w:basedOn w:val="1090"/>
+    <w:basedOn w:val="1092"/>
     <w:uiPriority w:val="99"/>
     <w:pPr>
       <w:pBdr/>
@@ -27371,9 +27717,9 @@
       </w:tcPr>
     </w:tblStylePr>
   </w:style>
-  <w:style w:type="table" w:styleId="1047">
+  <w:style w:type="table" w:styleId="1049">
     <w:name w:val="List Table 4 - Accent 6"/>
-    <w:basedOn w:val="1090"/>
+    <w:basedOn w:val="1092"/>
     <w:uiPriority w:val="99"/>
     <w:pPr>
       <w:pBdr/>
@@ -27586,9 +27932,9 @@
       </w:tcPr>
     </w:tblStylePr>
   </w:style>
-  <w:style w:type="table" w:styleId="1048">
+  <w:style w:type="table" w:styleId="1050">
     <w:name w:val="List Table 5 Dark"/>
-    <w:basedOn w:val="1090"/>
+    <w:basedOn w:val="1092"/>
     <w:uiPriority w:val="99"/>
     <w:pPr>
       <w:pBdr/>
@@ -27822,9 +28168,9 @@
       </w:tcPr>
     </w:tblStylePr>
   </w:style>
-  <w:style w:type="table" w:styleId="1049">
+  <w:style w:type="table" w:styleId="1051">
     <w:name w:val="List Table 5 Dark - Accent 1"/>
-    <w:basedOn w:val="1090"/>
+    <w:basedOn w:val="1092"/>
     <w:uiPriority w:val="99"/>
     <w:pPr>
       <w:pBdr/>
@@ -28058,9 +28404,9 @@
       </w:tcPr>
     </w:tblStylePr>
   </w:style>
-  <w:style w:type="table" w:styleId="1050">
+  <w:style w:type="table" w:styleId="1052">
     <w:name w:val="List Table 5 Dark - Accent 2"/>
-    <w:basedOn w:val="1090"/>
+    <w:basedOn w:val="1092"/>
     <w:uiPriority w:val="99"/>
     <w:pPr>
       <w:pBdr/>
@@ -28294,9 +28640,9 @@
       </w:tcPr>
     </w:tblStylePr>
   </w:style>
-  <w:style w:type="table" w:styleId="1051">
+  <w:style w:type="table" w:styleId="1053">
     <w:name w:val="List Table 5 Dark - Accent 3"/>
-    <w:basedOn w:val="1090"/>
+    <w:basedOn w:val="1092"/>
     <w:uiPriority w:val="99"/>
     <w:pPr>
       <w:pBdr/>
@@ -28530,9 +28876,9 @@
       </w:tcPr>
     </w:tblStylePr>
   </w:style>
-  <w:style w:type="table" w:styleId="1052">
+  <w:style w:type="table" w:styleId="1054">
     <w:name w:val="List Table 5 Dark - Accent 4"/>
-    <w:basedOn w:val="1090"/>
+    <w:basedOn w:val="1092"/>
     <w:uiPriority w:val="99"/>
     <w:pPr>
       <w:pBdr/>
@@ -28766,9 +29112,9 @@
       </w:tcPr>
     </w:tblStylePr>
   </w:style>
-  <w:style w:type="table" w:styleId="1053">
+  <w:style w:type="table" w:styleId="1055">
     <w:name w:val="List Table 5 Dark - Accent 5"/>
-    <w:basedOn w:val="1090"/>
+    <w:basedOn w:val="1092"/>
     <w:uiPriority w:val="99"/>
     <w:pPr>
       <w:pBdr/>
@@ -29002,9 +29348,9 @@
       </w:tcPr>
     </w:tblStylePr>
   </w:style>
-  <w:style w:type="table" w:styleId="1054">
+  <w:style w:type="table" w:styleId="1056">
     <w:name w:val="List Table 5 Dark - Accent 6"/>
-    <w:basedOn w:val="1090"/>
+    <w:basedOn w:val="1092"/>
     <w:uiPriority w:val="99"/>
     <w:pPr>
       <w:pBdr/>
@@ -29238,9 +29584,9 @@
       </w:tcPr>
     </w:tblStylePr>
   </w:style>
-  <w:style w:type="table" w:styleId="1055">
+  <w:style w:type="table" w:styleId="1057">
     <w:name w:val="List Table 6 Colorful"/>
-    <w:basedOn w:val="1090"/>
+    <w:basedOn w:val="1092"/>
     <w:uiPriority w:val="99"/>
     <w:pPr>
       <w:pBdr/>
@@ -29458,9 +29804,9 @@
       </w:tcPr>
     </w:tblStylePr>
   </w:style>
-  <w:style w:type="table" w:styleId="1056">
+  <w:style w:type="table" w:styleId="1058">
     <w:name w:val="List Table 6 Colorful - Accent 1"/>
-    <w:basedOn w:val="1090"/>
+    <w:basedOn w:val="1092"/>
     <w:uiPriority w:val="99"/>
     <w:pPr>
       <w:pBdr/>
@@ -29678,9 +30024,9 @@
       </w:tcPr>
     </w:tblStylePr>
   </w:style>
-  <w:style w:type="table" w:styleId="1057">
+  <w:style w:type="table" w:styleId="1059">
     <w:name w:val="List Table 6 Colorful - Accent 2"/>
-    <w:basedOn w:val="1090"/>
+    <w:basedOn w:val="1092"/>
     <w:uiPriority w:val="99"/>
     <w:pPr>
       <w:pBdr/>
@@ -29898,9 +30244,9 @@
       </w:tcPr>
     </w:tblStylePr>
   </w:style>
-  <w:style w:type="table" w:styleId="1058">
+  <w:style w:type="table" w:styleId="1060">
     <w:name w:val="List Table 6 Colorful - Accent 3"/>
-    <w:basedOn w:val="1090"/>
+    <w:basedOn w:val="1092"/>
     <w:uiPriority w:val="99"/>
     <w:pPr>
       <w:pBdr/>
@@ -30118,9 +30464,9 @@
       </w:tcPr>
     </w:tblStylePr>
   </w:style>
-  <w:style w:type="table" w:styleId="1059">
+  <w:style w:type="table" w:styleId="1061">
     <w:name w:val="List Table 6 Colorful - Accent 4"/>
-    <w:basedOn w:val="1090"/>
+    <w:basedOn w:val="1092"/>
     <w:uiPriority w:val="99"/>
     <w:pPr>
       <w:pBdr/>
@@ -30338,9 +30684,9 @@
       </w:tcPr>
     </w:tblStylePr>
   </w:style>
-  <w:style w:type="table" w:styleId="1060">
+  <w:style w:type="table" w:styleId="1062">
     <w:name w:val="List Table 6 Colorful - Accent 5"/>
-    <w:basedOn w:val="1090"/>
+    <w:basedOn w:val="1092"/>
     <w:uiPriority w:val="99"/>
     <w:pPr>
       <w:pBdr/>
@@ -30558,9 +30904,9 @@
       </w:tcPr>
     </w:tblStylePr>
   </w:style>
-  <w:style w:type="table" w:styleId="1061">
+  <w:style w:type="table" w:styleId="1063">
     <w:name w:val="List Table 6 Colorful - Accent 6"/>
-    <w:basedOn w:val="1090"/>
+    <w:basedOn w:val="1092"/>
     <w:uiPriority w:val="99"/>
     <w:pPr>
       <w:pBdr/>
@@ -30778,9 +31124,9 @@
       </w:tcPr>
     </w:tblStylePr>
   </w:style>
-  <w:style w:type="table" w:styleId="1062">
+  <w:style w:type="table" w:styleId="1064">
     <w:name w:val="List Table 7 Colorful"/>
-    <w:basedOn w:val="1090"/>
+    <w:basedOn w:val="1092"/>
     <w:uiPriority w:val="99"/>
     <w:pPr>
       <w:pBdr/>
@@ -31026,9 +31372,9 @@
       </w:tcPr>
     </w:tblStylePr>
   </w:style>
-  <w:style w:type="table" w:styleId="1063">
+  <w:style w:type="table" w:styleId="1065">
     <w:name w:val="List Table 7 Colorful - Accent 1"/>
-    <w:basedOn w:val="1090"/>
+    <w:basedOn w:val="1092"/>
     <w:uiPriority w:val="99"/>
     <w:pPr>
       <w:pBdr/>
@@ -31274,9 +31620,9 @@
       </w:tcPr>
     </w:tblStylePr>
   </w:style>
-  <w:style w:type="table" w:styleId="1064">
+  <w:style w:type="table" w:styleId="1066">
     <w:name w:val="List Table 7 Colorful - Accent 2"/>
-    <w:basedOn w:val="1090"/>
+    <w:basedOn w:val="1092"/>
     <w:uiPriority w:val="99"/>
     <w:pPr>
       <w:pBdr/>
@@ -31522,9 +31868,9 @@
       </w:tcPr>
     </w:tblStylePr>
   </w:style>
-  <w:style w:type="table" w:styleId="1065">
+  <w:style w:type="table" w:styleId="1067">
     <w:name w:val="List Table 7 Colorful - Accent 3"/>
-    <w:basedOn w:val="1090"/>
+    <w:basedOn w:val="1092"/>
     <w:uiPriority w:val="99"/>
     <w:pPr>
       <w:pBdr/>
@@ -31770,9 +32116,9 @@
       </w:tcPr>
     </w:tblStylePr>
   </w:style>
-  <w:style w:type="table" w:styleId="1066">
+  <w:style w:type="table" w:styleId="1068">
     <w:name w:val="List Table 7 Colorful - Accent 4"/>
-    <w:basedOn w:val="1090"/>
+    <w:basedOn w:val="1092"/>
     <w:uiPriority w:val="99"/>
     <w:pPr>
       <w:pBdr/>
@@ -32018,9 +32364,9 @@
       </w:tcPr>
     </w:tblStylePr>
   </w:style>
-  <w:style w:type="table" w:styleId="1067">
+  <w:style w:type="table" w:styleId="1069">
     <w:name w:val="List Table 7 Colorful - Accent 5"/>
-    <w:basedOn w:val="1090"/>
+    <w:basedOn w:val="1092"/>
     <w:uiPriority w:val="99"/>
     <w:pPr>
       <w:pBdr/>
@@ -32266,9 +32612,9 @@
       </w:tcPr>
     </w:tblStylePr>
   </w:style>
-  <w:style w:type="table" w:styleId="1068">
+  <w:style w:type="table" w:styleId="1070">
     <w:name w:val="List Table 7 Colorful - Accent 6"/>
-    <w:basedOn w:val="1090"/>
+    <w:basedOn w:val="1092"/>
     <w:uiPriority w:val="99"/>
     <w:pPr>
       <w:pBdr/>
@@ -32514,9 +32860,9 @@
       </w:tcPr>
     </w:tblStylePr>
   </w:style>
-  <w:style w:type="table" w:styleId="1069">
+  <w:style w:type="table" w:styleId="1071">
     <w:name w:val="Lined - Accent"/>
-    <w:basedOn w:val="1090"/>
+    <w:basedOn w:val="1092"/>
     <w:uiPriority w:val="99"/>
     <w:pPr>
       <w:pBdr/>
@@ -32731,9 +33077,9 @@
       </w:tcPr>
     </w:tblStylePr>
   </w:style>
-  <w:style w:type="table" w:styleId="1070">
+  <w:style w:type="table" w:styleId="1072">
     <w:name w:val="Lined - Accent 1"/>
-    <w:basedOn w:val="1090"/>
+    <w:basedOn w:val="1092"/>
     <w:uiPriority w:val="99"/>
     <w:pPr>
       <w:pBdr/>
@@ -32948,9 +33294,9 @@
       </w:tcPr>
     </w:tblStylePr>
   </w:style>
-  <w:style w:type="table" w:styleId="1071">
+  <w:style w:type="table" w:styleId="1073">
     <w:name w:val="Lined - Accent 2"/>
-    <w:basedOn w:val="1090"/>
+    <w:basedOn w:val="1092"/>
     <w:uiPriority w:val="99"/>
     <w:pPr>
       <w:pBdr/>
@@ -33165,9 +33511,9 @@
       </w:tcPr>
     </w:tblStylePr>
   </w:style>
-  <w:style w:type="table" w:styleId="1072">
+  <w:style w:type="table" w:styleId="1074">
     <w:name w:val="Lined - Accent 3"/>
-    <w:basedOn w:val="1090"/>
+    <w:basedOn w:val="1092"/>
     <w:uiPriority w:val="99"/>
     <w:pPr>
       <w:pBdr/>
@@ -33382,9 +33728,9 @@
       </w:tcPr>
     </w:tblStylePr>
   </w:style>
-  <w:style w:type="table" w:styleId="1073">
+  <w:style w:type="table" w:styleId="1075">
     <w:name w:val="Lined - Accent 4"/>
-    <w:basedOn w:val="1090"/>
+    <w:basedOn w:val="1092"/>
     <w:uiPriority w:val="99"/>
     <w:pPr>
       <w:pBdr/>
@@ -33599,9 +33945,9 @@
       </w:tcPr>
     </w:tblStylePr>
   </w:style>
-  <w:style w:type="table" w:styleId="1074">
+  <w:style w:type="table" w:styleId="1076">
     <w:name w:val="Lined - Accent 5"/>
-    <w:basedOn w:val="1090"/>
+    <w:basedOn w:val="1092"/>
     <w:uiPriority w:val="99"/>
     <w:pPr>
       <w:pBdr/>
@@ -33816,9 +34162,9 @@
       </w:tcPr>
     </w:tblStylePr>
   </w:style>
-  <w:style w:type="table" w:styleId="1075">
+  <w:style w:type="table" w:styleId="1077">
     <w:name w:val="Lined - Accent 6"/>
-    <w:basedOn w:val="1090"/>
+    <w:basedOn w:val="1092"/>
     <w:uiPriority w:val="99"/>
     <w:pPr>
       <w:pBdr/>
@@ -34033,9 +34379,9 @@
       </w:tcPr>
     </w:tblStylePr>
   </w:style>
-  <w:style w:type="table" w:styleId="1076">
+  <w:style w:type="table" w:styleId="1078">
     <w:name w:val="Bordered &amp; Lined - Accent"/>
-    <w:basedOn w:val="1090"/>
+    <w:basedOn w:val="1092"/>
     <w:uiPriority w:val="99"/>
     <w:pPr>
       <w:pBdr/>
@@ -34257,9 +34603,9 @@
       </w:tcPr>
     </w:tblStylePr>
   </w:style>
-  <w:style w:type="table" w:styleId="1077">
+  <w:style w:type="table" w:styleId="1079">
     <w:name w:val="Bordered &amp; Lined - Accent 1"/>
-    <w:basedOn w:val="1090"/>
+    <w:basedOn w:val="1092"/>
     <w:uiPriority w:val="99"/>
     <w:pPr>
       <w:pBdr/>
@@ -34481,9 +34827,9 @@
       </w:tcPr>
     </w:tblStylePr>
   </w:style>
-  <w:style w:type="table" w:styleId="1078">
+  <w:style w:type="table" w:styleId="1080">
     <w:name w:val="Bordered &amp; Lined - Accent 2"/>
-    <w:basedOn w:val="1090"/>
+    <w:basedOn w:val="1092"/>
     <w:uiPriority w:val="99"/>
     <w:pPr>
       <w:pBdr/>
@@ -34705,9 +35051,9 @@
       </w:tcPr>
     </w:tblStylePr>
   </w:style>
-  <w:style w:type="table" w:styleId="1079">
+  <w:style w:type="table" w:styleId="1081">
     <w:name w:val="Bordered &amp; Lined - Accent 3"/>
-    <w:basedOn w:val="1090"/>
+    <w:basedOn w:val="1092"/>
     <w:uiPriority w:val="99"/>
     <w:pPr>
       <w:pBdr/>
@@ -34929,9 +35275,9 @@
       </w:tcPr>
     </w:tblStylePr>
   </w:style>
-  <w:style w:type="table" w:styleId="1080">
+  <w:style w:type="table" w:styleId="1082">
     <w:name w:val="Bordered &amp; Lined - Accent 4"/>
-    <w:basedOn w:val="1090"/>
+    <w:basedOn w:val="1092"/>
     <w:uiPriority w:val="99"/>
     <w:pPr>
       <w:pBdr/>
@@ -35153,9 +35499,9 @@
       </w:tcPr>
     </w:tblStylePr>
   </w:style>
-  <w:style w:type="table" w:styleId="1081">
+  <w:style w:type="table" w:styleId="1083">
     <w:name w:val="Bordered &amp; Lined - Accent 5"/>
-    <w:basedOn w:val="1090"/>
+    <w:basedOn w:val="1092"/>
     <w:uiPriority w:val="99"/>
     <w:pPr>
       <w:pBdr/>
@@ -35377,9 +35723,9 @@
       </w:tcPr>
     </w:tblStylePr>
   </w:style>
-  <w:style w:type="table" w:styleId="1082">
+  <w:style w:type="table" w:styleId="1084">
     <w:name w:val="Bordered &amp; Lined - Accent 6"/>
-    <w:basedOn w:val="1090"/>
+    <w:basedOn w:val="1092"/>
     <w:uiPriority w:val="99"/>
     <w:pPr>
       <w:pBdr/>
@@ -35601,9 +35947,9 @@
       </w:tcPr>
     </w:tblStylePr>
   </w:style>
-  <w:style w:type="table" w:styleId="1083">
+  <w:style w:type="table" w:styleId="1085">
     <w:name w:val="Bordered"/>
-    <w:basedOn w:val="1090"/>
+    <w:basedOn w:val="1092"/>
     <w:uiPriority w:val="99"/>
     <w:pPr>
       <w:pBdr/>
@@ -35821,9 +36167,9 @@
       </w:tcPr>
     </w:tblStylePr>
   </w:style>
-  <w:style w:type="table" w:styleId="1084">
+  <w:style w:type="table" w:styleId="1086">
     <w:name w:val="Bordered - Accent 1"/>
-    <w:basedOn w:val="1090"/>
+    <w:basedOn w:val="1092"/>
     <w:uiPriority w:val="99"/>
     <w:pPr>
       <w:pBdr/>
@@ -36041,9 +36387,9 @@
       </w:tcPr>
     </w:tblStylePr>
   </w:style>
-  <w:style w:type="table" w:styleId="1085">
+  <w:style w:type="table" w:styleId="1087">
     <w:name w:val="Bordered - Accent 2"/>
-    <w:basedOn w:val="1090"/>
+    <w:basedOn w:val="1092"/>
     <w:uiPriority w:val="99"/>
     <w:pPr>
       <w:pBdr/>
@@ -36261,9 +36607,9 @@
       </w:tcPr>
     </w:tblStylePr>
   </w:style>
-  <w:style w:type="table" w:styleId="1086">
+  <w:style w:type="table" w:styleId="1088">
     <w:name w:val="Bordered - Accent 3"/>
-    <w:basedOn w:val="1090"/>
+    <w:basedOn w:val="1092"/>
     <w:uiPriority w:val="99"/>
     <w:pPr>
       <w:pBdr/>
@@ -36481,9 +36827,9 @@
       </w:tcPr>
     </w:tblStylePr>
   </w:style>
-  <w:style w:type="table" w:styleId="1087">
+  <w:style w:type="table" w:styleId="1089">
     <w:name w:val="Bordered - Accent 4"/>
-    <w:basedOn w:val="1090"/>
+    <w:basedOn w:val="1092"/>
     <w:uiPriority w:val="99"/>
     <w:pPr>
       <w:pBdr/>
@@ -36701,9 +37047,9 @@
       </w:tcPr>
     </w:tblStylePr>
   </w:style>
-  <w:style w:type="table" w:styleId="1088">
+  <w:style w:type="table" w:styleId="1090">
     <w:name w:val="Bordered - Accent 5"/>
-    <w:basedOn w:val="1090"/>
+    <w:basedOn w:val="1092"/>
     <w:uiPriority w:val="99"/>
     <w:pPr>
       <w:pBdr/>
@@ -36921,9 +37267,9 @@
       </w:tcPr>
     </w:tblStylePr>
   </w:style>
-  <w:style w:type="table" w:styleId="1089">
+  <w:style w:type="table" w:styleId="1091">
     <w:name w:val="Bordered - Accent 6"/>
-    <w:basedOn w:val="1090"/>
+    <w:basedOn w:val="1092"/>
     <w:uiPriority w:val="99"/>
     <w:pPr>
       <w:pBdr/>
@@ -37141,7 +37487,7 @@
       </w:tcPr>
     </w:tblStylePr>
   </w:style>
-  <w:style w:type="table" w:styleId="1090" w:default="1">
+  <w:style w:type="table" w:styleId="1092" w:default="1">
     <w:name w:val="Normal Table"/>
     <w:uiPriority w:val="99"/>
     <w:semiHidden/>
@@ -37333,9 +37679,9 @@
       </w:tcPr>
     </w:tblStylePr>
   </w:style>
-  <w:style w:type="table" w:styleId="1091">
+  <w:style w:type="table" w:styleId="1093">
     <w:name w:val="Table Grid"/>
-    <w:basedOn w:val="1090"/>
+    <w:basedOn w:val="1092"/>
     <w:uiPriority w:val="59"/>
     <w:pPr>
       <w:pBdr/>

</xml_diff>